<commit_message>
Add signature exhibit-plate frame to all figures; remove duplicate titling
Every chart/diagram now carries a single recurring branded device — a
gold rule, "AMIU EXHIBIT [numeral]" kicker, corner brackets, and a micro
running footer — so a figure reads as AMIU's own regardless of chart
type, addressing the ask for a distinctive, non-generic visual language
for data visualizations rather than default matplotlib exports.

Also removed the in-image titles that duplicated the markdown caption
text below each figure verbatim (a template-like redundancy), letting
the document's own caption typography carry the title instead, and
trimmed each diagram's reserved vertical space now that the title text
is gone.
</commit_message>
<xml_diff>
--- a/AMIU_Strategic_Blueprint_2028-2050_Publication_Edition.docx
+++ b/AMIU_Strategic_Blueprint_2028-2050_Publication_Edition.docx
@@ -9786,7 +9786,7 @@
       <w:r>
         <w:drawing>
           <wp:inline>
-            <wp:extent cx="5292852" cy="3131819"/>
+            <wp:extent cx="5292852" cy="3085199"/>
             <wp:effectExtent b="0" l="0" r="0" t="0"/>
             <wp:docPr descr="Figure 1. Ten-Year Enrollment Growth, Founding Decade (Adopted Growth Scenario)" title="" id="42" name="Picture"/>
             <a:graphic>
@@ -9807,7 +9807,7 @@
                   <pic:spPr bwMode="auto">
                     <a:xfrm>
                       <a:off x="0" y="0"/>
-                      <a:ext cx="5292852" cy="3131819"/>
+                      <a:ext cx="5292852" cy="3085199"/>
                     </a:xfrm>
                     <a:prstGeom prst="rect">
                       <a:avLst/>
@@ -9863,7 +9863,7 @@
       <w:r>
         <w:drawing>
           <wp:inline>
-            <wp:extent cx="5292852" cy="3365208"/>
+            <wp:extent cx="5292852" cy="3181684"/>
             <wp:effectExtent b="0" l="0" r="0" t="0"/>
             <wp:docPr descr="Figure 2. Ten-Year Gross Revenue Trajectory, Founding Decade (2028–2037)" title="" id="45" name="Picture"/>
             <a:graphic>
@@ -9884,7 +9884,7 @@
                   <pic:spPr bwMode="auto">
                     <a:xfrm>
                       <a:off x="0" y="0"/>
-                      <a:ext cx="5292852" cy="3365208"/>
+                      <a:ext cx="5292852" cy="3181684"/>
                     </a:xfrm>
                     <a:prstGeom prst="rect">
                       <a:avLst/>
@@ -13301,7 +13301,7 @@
       <w:r>
         <w:drawing>
           <wp:inline>
-            <wp:extent cx="5292852" cy="4178029"/>
+            <wp:extent cx="5292852" cy="4349279"/>
             <wp:effectExtent b="0" l="0" r="0" t="0"/>
             <wp:docPr descr="Figure 3. AMIU Governance &amp; Organisational Structure" title="" id="53" name="Picture"/>
             <a:graphic>
@@ -13322,7 +13322,7 @@
                   <pic:spPr bwMode="auto">
                     <a:xfrm>
                       <a:off x="0" y="0"/>
-                      <a:ext cx="5292852" cy="4178029"/>
+                      <a:ext cx="5292852" cy="4349279"/>
                     </a:xfrm>
                     <a:prstGeom prst="rect">
                       <a:avLst/>
@@ -14373,7 +14373,7 @@
       <w:r>
         <w:drawing>
           <wp:inline>
-            <wp:extent cx="5292852" cy="4223615"/>
+            <wp:extent cx="5292852" cy="4350289"/>
             <wp:effectExtent b="0" l="0" r="0" t="0"/>
             <wp:docPr descr="Figure 4. The Seven-Tier Stackable Academic Ladder" title="" id="57" name="Picture"/>
             <a:graphic>
@@ -14394,7 +14394,7 @@
                   <pic:spPr bwMode="auto">
                     <a:xfrm>
                       <a:off x="0" y="0"/>
-                      <a:ext cx="5292852" cy="4223615"/>
+                      <a:ext cx="5292852" cy="4350289"/>
                     </a:xfrm>
                     <a:prstGeom prst="rect">
                       <a:avLst/>
@@ -21313,7 +21313,7 @@
       <w:r>
         <w:drawing>
           <wp:inline>
-            <wp:extent cx="5292852" cy="2099663"/>
+            <wp:extent cx="5292852" cy="2199197"/>
             <wp:effectExtent b="0" l="0" r="0" t="0"/>
             <wp:docPr descr="Figure 5. Student Journey Map: Inquiry to Alumni" title="" id="66" name="Picture"/>
             <a:graphic>
@@ -21334,7 +21334,7 @@
                   <pic:spPr bwMode="auto">
                     <a:xfrm>
                       <a:off x="0" y="0"/>
-                      <a:ext cx="5292852" cy="2099663"/>
+                      <a:ext cx="5292852" cy="2199197"/>
                     </a:xfrm>
                     <a:prstGeom prst="rect">
                       <a:avLst/>
@@ -27538,7 +27538,7 @@
       <w:r>
         <w:drawing>
           <wp:inline>
-            <wp:extent cx="5292852" cy="2437053"/>
+            <wp:extent cx="5292852" cy="2536328"/>
             <wp:effectExtent b="0" l="0" r="0" t="0"/>
             <wp:docPr descr="Figure 6. Accreditation &amp; International Expansion Roadmap, 2028–2047" title="" id="75" name="Picture"/>
             <a:graphic>
@@ -27559,7 +27559,7 @@
                   <pic:spPr bwMode="auto">
                     <a:xfrm>
                       <a:off x="0" y="0"/>
-                      <a:ext cx="5292852" cy="2437053"/>
+                      <a:ext cx="5292852" cy="2536328"/>
                     </a:xfrm>
                     <a:prstGeom prst="rect">
                       <a:avLst/>
@@ -32746,7 +32746,7 @@
       <w:r>
         <w:drawing>
           <wp:inline>
-            <wp:extent cx="5292852" cy="3170658"/>
+            <wp:extent cx="5292852" cy="3256597"/>
             <wp:effectExtent b="0" l="0" r="0" t="0"/>
             <wp:docPr descr="Figure 7. Waqf &amp; Stakeholder Reserve: Distributed-Fund Allocation" title="" id="84" name="Picture"/>
             <a:graphic>
@@ -32767,7 +32767,7 @@
                   <pic:spPr bwMode="auto">
                     <a:xfrm>
                       <a:off x="0" y="0"/>
-                      <a:ext cx="5292852" cy="3170658"/>
+                      <a:ext cx="5292852" cy="3256597"/>
                     </a:xfrm>
                     <a:prstGeom prst="rect">
                       <a:avLst/>
@@ -44658,7 +44658,7 @@
       <w:r>
         <w:drawing>
           <wp:inline>
-            <wp:extent cx="5292852" cy="3759432"/>
+            <wp:extent cx="5292852" cy="3670321"/>
             <wp:effectExtent b="0" l="0" r="0" t="0"/>
             <wp:docPr descr="Figure 8. Revenue Allocation Framework — Fixed Annual Percentage of Gross Revenue" title="" id="100" name="Picture"/>
             <a:graphic>
@@ -44679,7 +44679,7 @@
                   <pic:spPr bwMode="auto">
                     <a:xfrm>
                       <a:off x="0" y="0"/>
-                      <a:ext cx="5292852" cy="3759432"/>
+                      <a:ext cx="5292852" cy="3670321"/>
                     </a:xfrm>
                     <a:prstGeom prst="rect">
                       <a:avLst/>
@@ -45752,7 +45752,7 @@
       <w:r>
         <w:drawing>
           <wp:inline>
-            <wp:extent cx="5292852" cy="3543677"/>
+            <wp:extent cx="5292852" cy="3697745"/>
             <wp:effectExtent b="0" l="0" r="0" t="0"/>
             <wp:docPr descr="Figure 9. Capital Architecture: The Tuition Firewall" title="" id="104" name="Picture"/>
             <a:graphic>
@@ -45773,7 +45773,7 @@
                   <pic:spPr bwMode="auto">
                     <a:xfrm>
                       <a:off x="0" y="0"/>
-                      <a:ext cx="5292852" cy="3543677"/>
+                      <a:ext cx="5292852" cy="3697745"/>
                     </a:xfrm>
                     <a:prstGeom prst="rect">
                       <a:avLst/>
@@ -46920,7 +46920,7 @@
       <w:r>
         <w:drawing>
           <wp:inline>
-            <wp:extent cx="5292852" cy="3144268"/>
+            <wp:extent cx="5292852" cy="3043005"/>
             <wp:effectExtent b="0" l="0" r="0" t="0"/>
             <wp:docPr descr="Figure 10. Twenty-Year Illustrative Revenue Trajectory, 2028–2047" title="" id="108" name="Picture"/>
             <a:graphic>
@@ -46941,7 +46941,7 @@
                   <pic:spPr bwMode="auto">
                     <a:xfrm>
                       <a:off x="0" y="0"/>
-                      <a:ext cx="5292852" cy="3144268"/>
+                      <a:ext cx="5292852" cy="3043005"/>
                     </a:xfrm>
                     <a:prstGeom prst="rect">
                       <a:avLst/>

</xml_diff>

<commit_message>
Add the signature callout framework (shaded KPI/Risk boxes)
Extends the existing gold-eyebrow detection (already proven reliable
across all 41 sections' inconsistent label phrasing) into a shaded
callout band: a light tint background plus a gold accent bar for every
KPIs and Risks & Mitigation block. Detection stays structural — reuses
the already-styled eyebrow run rather than matching label text — and
any instance immediately followed by a table is left unboxed rather
than guessed at, so the change carries no risk to the document's
working tables.

This was deliberately deferred earlier in the project once already,
when per-section phrasing looked too inconsistent to template safely;
reusing the eyebrow detector instead of raw text matching removes that
risk. Verified across bullet lists, inline-colon labels, multi-
paragraph prose, and the table-skip case before committing.
</commit_message>
<xml_diff>
--- a/AMIU_Strategic_Blueprint_2028-2050_Publication_Edition.docx
+++ b/AMIU_Strategic_Blueprint_2028-2050_Publication_Edition.docx
@@ -2536,7 +2536,7 @@
               <w:jc w:val="right"/>
             </w:pPr>
             <w:r>
-              <w:t xml:space="preserve">39</w:t>
+              <w:t xml:space="preserve">38</w:t>
             </w:r>
           </w:p>
         </w:tc>
@@ -10273,6 +10273,12 @@
     <w:p>
       <w:pPr>
         <w:pStyle w:val="BodyText"/>
+        <w:shd w:val="clear" w:color="auto" w:fill="F7F3E8"/>
+        <w:pBdr>
+          <w:left w:val="single" w:sz="24" w:space="10" w:color="B08625"/>
+        </w:pBdr>
+        <w:ind w:left="300"/>
+        <w:spacing w:after="0"/>
       </w:pPr>
       <w:r>
         <w:rPr>
@@ -10293,6 +10299,12 @@
           <w:numId w:val="1001"/>
         </w:numPr>
         <w:pStyle w:val="Compact"/>
+        <w:shd w:val="clear" w:color="auto" w:fill="F7F3E8"/>
+        <w:pBdr>
+          <w:left w:val="single" w:sz="24" w:space="10" w:color="B08625"/>
+        </w:pBdr>
+        <w:ind w:left="300"/>
+        <w:spacing w:before="0" w:after="0"/>
       </w:pPr>
       <w:r>
         <w:t xml:space="preserve">Active enrolment vs. Master Plan targets (347 / 3,493 / 11,021 at Years 1/5/10)</w:t>
@@ -10305,6 +10317,12 @@
           <w:numId w:val="1001"/>
         </w:numPr>
         <w:pStyle w:val="Compact"/>
+        <w:shd w:val="clear" w:color="auto" w:fill="F7F3E8"/>
+        <w:pBdr>
+          <w:left w:val="single" w:sz="24" w:space="10" w:color="B08625"/>
+        </w:pBdr>
+        <w:ind w:left="300"/>
+        <w:spacing w:before="0" w:after="0"/>
       </w:pPr>
       <w:r>
         <w:t xml:space="preserve">Number of jurisdictions holding active accreditation or recognition</w:t>
@@ -10317,6 +10335,12 @@
           <w:numId w:val="1001"/>
         </w:numPr>
         <w:pStyle w:val="Compact"/>
+        <w:shd w:val="clear" w:color="auto" w:fill="F7F3E8"/>
+        <w:pBdr>
+          <w:left w:val="single" w:sz="24" w:space="10" w:color="B08625"/>
+        </w:pBdr>
+        <w:ind w:left="300"/>
+        <w:spacing w:before="0" w:after="0"/>
       </w:pPr>
       <w:r>
         <w:t xml:space="preserve">Ratio of secular-program revenue to religious-program revenue post-2038 (monitor for mission-drift)</w:t>
@@ -10329,6 +10353,12 @@
           <w:numId w:val="1001"/>
         </w:numPr>
         <w:pStyle w:val="Compact"/>
+        <w:shd w:val="clear" w:color="auto" w:fill="F7F3E8"/>
+        <w:pBdr>
+          <w:left w:val="single" w:sz="24" w:space="10" w:color="B08625"/>
+        </w:pBdr>
+        <w:ind w:left="300"/>
+        <w:spacing w:before="0"/>
       </w:pPr>
       <w:r>
         <w:t xml:space="preserve">Waqf &amp; Stakeholder Reserve balance growth (target: real institutional scale by 2048-2050, not merely nominal growth)</w:t>
@@ -10337,6 +10367,12 @@
     <w:p>
       <w:pPr>
         <w:pStyle w:val="FirstParagraph"/>
+        <w:shd w:val="clear" w:color="auto" w:fill="F7F3E8"/>
+        <w:pBdr>
+          <w:left w:val="single" w:sz="24" w:space="10" w:color="B08625"/>
+        </w:pBdr>
+        <w:ind w:left="300"/>
+        <w:spacing w:after="0"/>
       </w:pPr>
       <w:r>
         <w:rPr>
@@ -10353,6 +10389,12 @@
     <w:p>
       <w:pPr>
         <w:pStyle w:val="BodyText"/>
+        <w:shd w:val="clear" w:color="auto" w:fill="F7F3E8"/>
+        <w:pBdr>
+          <w:left w:val="single" w:sz="24" w:space="10" w:color="B08625"/>
+        </w:pBdr>
+        <w:ind w:left="300"/>
+        <w:spacing w:before="0"/>
       </w:pPr>
       <w:r>
         <w:t xml:space="preserve">Premature secular pivot risking the Texas religious exemption is mitigated by the fixed Year-11 sequencing already in the Master Plan (Risk Register items on IRS commingling scrutiny and accreditation candidacy delay). Over-promising Phase III figures is mitigated by explicitly labelling 2048-2050 numbers as non-binding extrapolations, reviewed and re-forecast no later than Year 15 (2042) against actual results. Nigeria approval risk (sovereign process, outside AMIU’s control) means Phase III</w:t>
@@ -10965,6 +11007,12 @@
     <w:p>
       <w:pPr>
         <w:pStyle w:val="BodyText"/>
+        <w:shd w:val="clear" w:color="auto" w:fill="F7F3E8"/>
+        <w:pBdr>
+          <w:left w:val="single" w:sz="24" w:space="10" w:color="B08625"/>
+        </w:pBdr>
+        <w:ind w:left="300"/>
+        <w:spacing w:after="0"/>
       </w:pPr>
       <w:r>
         <w:rPr>
@@ -10981,6 +11029,12 @@
     <w:p>
       <w:pPr>
         <w:pStyle w:val="BodyText"/>
+        <w:shd w:val="clear" w:color="auto" w:fill="F7F3E8"/>
+        <w:pBdr>
+          <w:left w:val="single" w:sz="24" w:space="10" w:color="B08625"/>
+        </w:pBdr>
+        <w:ind w:left="300"/>
+        <w:spacing w:before="0"/>
       </w:pPr>
       <w:r>
         <w:t xml:space="preserve">Percentage of Tier-4/sponsored students enrolled (Access); number of Sharī’ah-compliance exceptions flagged and resolved (Morality); faculty ijāzah/credential verification completion rate (Sanad); Waqf disbursement-to-allocation ratio (Love, target ~100% of the fixed 20% deployed, not hoarded or diverted).</w:t>
@@ -10989,6 +11043,12 @@
     <w:p>
       <w:pPr>
         <w:pStyle w:val="BodyText"/>
+        <w:shd w:val="clear" w:color="auto" w:fill="F7F3E8"/>
+        <w:pBdr>
+          <w:left w:val="single" w:sz="24" w:space="10" w:color="B08625"/>
+        </w:pBdr>
+        <w:ind w:left="300"/>
+        <w:spacing w:after="0"/>
       </w:pPr>
       <w:r>
         <w:rPr>
@@ -11005,6 +11065,12 @@
     <w:p>
       <w:pPr>
         <w:pStyle w:val="BodyText"/>
+        <w:shd w:val="clear" w:color="auto" w:fill="F7F3E8"/>
+        <w:pBdr>
+          <w:left w:val="single" w:sz="24" w:space="10" w:color="B08625"/>
+        </w:pBdr>
+        <w:ind w:left="300"/>
+        <w:spacing w:before="0"/>
       </w:pPr>
       <w:r>
         <w:t xml:space="preserve">Chief risk is</w:t>
@@ -11476,6 +11542,12 @@
     <w:p>
       <w:pPr>
         <w:pStyle w:val="BodyText"/>
+        <w:shd w:val="clear" w:color="auto" w:fill="F7F3E8"/>
+        <w:pBdr>
+          <w:left w:val="single" w:sz="24" w:space="10" w:color="B08625"/>
+        </w:pBdr>
+        <w:ind w:left="300"/>
+        <w:spacing w:after="0"/>
       </w:pPr>
       <w:r>
         <w:rPr>
@@ -11492,6 +11564,12 @@
     <w:p>
       <w:pPr>
         <w:pStyle w:val="BodyText"/>
+        <w:shd w:val="clear" w:color="auto" w:fill="F7F3E8"/>
+        <w:pBdr>
+          <w:left w:val="single" w:sz="24" w:space="10" w:color="B08625"/>
+        </w:pBdr>
+        <w:ind w:left="300"/>
+        <w:spacing w:before="0"/>
       </w:pPr>
       <w:r>
         <w:t xml:space="preserve">Committee meeting-completion rate against annual calendar; number of Risk Register items with current mitigation status vs. stale/unreviewed; average Waqf Scholarship Block adjudication time (target: at or under the 14-day standard); Audit &amp; Risk findings closed within the fiscal year.</w:t>
@@ -11500,6 +11578,12 @@
     <w:p>
       <w:pPr>
         <w:pStyle w:val="BodyText"/>
+        <w:shd w:val="clear" w:color="auto" w:fill="F7F3E8"/>
+        <w:pBdr>
+          <w:left w:val="single" w:sz="24" w:space="10" w:color="B08625"/>
+        </w:pBdr>
+        <w:ind w:left="300"/>
+        <w:spacing w:after="0"/>
       </w:pPr>
       <w:r>
         <w:rPr>
@@ -11516,6 +11600,12 @@
     <w:p>
       <w:pPr>
         <w:pStyle w:val="BodyText"/>
+        <w:shd w:val="clear" w:color="auto" w:fill="F7F3E8"/>
+        <w:pBdr>
+          <w:left w:val="single" w:sz="24" w:space="10" w:color="B08625"/>
+        </w:pBdr>
+        <w:ind w:left="300"/>
+        <w:spacing w:before="0"/>
       </w:pPr>
       <w:r>
         <w:t xml:space="preserve">Overlapping mandates (e.g., Sharī’ah Advisory Board vs. Waqf &amp; Endowment Board both touching Waqf deployment) are mitigated by the explicit fiduciary/academic split in the table above. Committee capture by founders is structurally prevented by the independence safeguard: founder compensation requires all four independent seats’ approval, and large Waqf deployments require 2/3 Senate plus ≥2 independent seats — no committee recommendation can bypass this.</w:t>
@@ -12420,6 +12510,12 @@
     <w:p>
       <w:pPr>
         <w:pStyle w:val="BodyText"/>
+        <w:shd w:val="clear" w:color="auto" w:fill="F7F3E8"/>
+        <w:pBdr>
+          <w:left w:val="single" w:sz="24" w:space="10" w:color="B08625"/>
+        </w:pBdr>
+        <w:ind w:left="300"/>
+        <w:spacing w:after="0"/>
       </w:pPr>
       <w:r>
         <w:rPr>
@@ -12436,6 +12532,12 @@
     <w:p>
       <w:pPr>
         <w:pStyle w:val="BodyText"/>
+        <w:shd w:val="clear" w:color="auto" w:fill="F7F3E8"/>
+        <w:pBdr>
+          <w:left w:val="single" w:sz="24" w:space="10" w:color="B08625"/>
+        </w:pBdr>
+        <w:ind w:left="300"/>
+        <w:spacing w:before="0"/>
       </w:pPr>
       <w:r>
         <w:t xml:space="preserve">Key-person risk (3 founders occupying influence over Seats 2-4) is the most material Senate-specific risk on the Register; mitigation is the Year-3 (2030) mandatory succession-plan filing, reviewed annually by the Audit &amp; Risk Committee. Independent-seat capture risk is mitigated by returning-officer neutrality and Audit &amp; Risk certification of election results. Quorum failure risk (small faculty body in Year 1-2) is mitigated by ex officio seats (Groups I-III) being immediately fillable regardless of election timing, ensuring the Senate can convene from Day 1 even before independent elections mature.</w:t>
@@ -12906,6 +13008,12 @@
     <w:p>
       <w:pPr>
         <w:pStyle w:val="BodyText"/>
+        <w:shd w:val="clear" w:color="auto" w:fill="F7F3E8"/>
+        <w:pBdr>
+          <w:left w:val="single" w:sz="24" w:space="10" w:color="B08625"/>
+        </w:pBdr>
+        <w:ind w:left="300"/>
+        <w:spacing w:after="0"/>
       </w:pPr>
       <w:r>
         <w:rPr>
@@ -12922,6 +13030,12 @@
     <w:p>
       <w:pPr>
         <w:pStyle w:val="BodyText"/>
+        <w:shd w:val="clear" w:color="auto" w:fill="F7F3E8"/>
+        <w:pBdr>
+          <w:left w:val="single" w:sz="24" w:space="10" w:color="B08625"/>
+        </w:pBdr>
+        <w:ind w:left="300"/>
+        <w:spacing w:before="0"/>
       </w:pPr>
       <w:r>
         <w:t xml:space="preserve">Trustee meeting attendance rate; conflict-of-interest disclosures filed on schedule (annual, 100% compliance target); Commercial Engine firewall audit findings (target: zero commingling findings per fiscal year); tuition-tier decisions made within Board-exclusive process with no Senate encroachment recorded.</w:t>
@@ -12930,6 +13044,12 @@
     <w:p>
       <w:pPr>
         <w:pStyle w:val="BodyText"/>
+        <w:shd w:val="clear" w:color="auto" w:fill="F7F3E8"/>
+        <w:pBdr>
+          <w:left w:val="single" w:sz="24" w:space="10" w:color="B08625"/>
+        </w:pBdr>
+        <w:ind w:left="300"/>
+        <w:spacing w:after="0"/>
       </w:pPr>
       <w:r>
         <w:rPr>
@@ -12946,6 +13066,12 @@
     <w:p>
       <w:pPr>
         <w:pStyle w:val="BodyText"/>
+        <w:shd w:val="clear" w:color="auto" w:fill="F7F3E8"/>
+        <w:pBdr>
+          <w:left w:val="single" w:sz="24" w:space="10" w:color="B08625"/>
+        </w:pBdr>
+        <w:ind w:left="300"/>
+        <w:spacing w:before="0" w:after="0"/>
       </w:pPr>
       <w:r>
         <w:t xml:space="preserve">The Commercial Engine underperformance and credibility/offering risks (Risk Register items) are mitigated structurally: no tuition revenue may ever fund investor returns, no shared bank accounts exist, and any future amendment reopening that path requires full Senate independent-seat supermajority plus independent legal counsel opinion — a Board cannot unilaterally weaken the firewall. IRS nonprofit/for-profit commingling scrutiny risk is mitigated by the Legal Affairs Director’s standing mandate to certify firewall integrity annually to the Audit &amp; Risk Committee. Trustee entrenchment risk is mitigated by term limits and staggered rotation (below).</w:t>
@@ -12954,6 +13080,12 @@
     <w:p>
       <w:pPr>
         <w:pStyle w:val="BodyText"/>
+        <w:shd w:val="clear" w:color="auto" w:fill="F7F3E8"/>
+        <w:pBdr>
+          <w:left w:val="single" w:sz="24" w:space="10" w:color="B08625"/>
+        </w:pBdr>
+        <w:ind w:left="300"/>
+        <w:spacing w:before="0" w:after="0"/>
       </w:pPr>
       <w:r>
         <w:rPr>
@@ -12966,6 +13098,12 @@
     <w:p>
       <w:pPr>
         <w:pStyle w:val="BodyText"/>
+        <w:shd w:val="clear" w:color="auto" w:fill="F7F3E8"/>
+        <w:pBdr>
+          <w:left w:val="single" w:sz="24" w:space="10" w:color="B08625"/>
+        </w:pBdr>
+        <w:ind w:left="300"/>
+        <w:spacing w:before="0"/>
       </w:pPr>
       <w:r>
         <w:t xml:space="preserve">Recruitment is skills-based against the six named roles above, not honorary; candidates are vetted by the Governance Specialist function and confirmed by existing trustees. Standard term is 3 years, renewable up to two consecutive terms (6 years), then a mandatory one-term gap before eligibility to serve again — mirroring the Senate independent-seat discipline for consistency across the bicameral structure. Founder/Vision Architect continuity is the one role permitted longer tenure given key-person considerations, but founder compensation remains subject to the Senate’s 4-independent-seat unanimous-approval check regardless of Board term length, preventing the founder role from becoming self-dealing by default. All trustees file annual written conflict-of-interest disclosures, reviewed by the Audit &amp; Risk Committee, with mandatory recusal on any vote where a disclosed interest exists (particularly relevant for Commercial Engine oversight votes involving the Founder role).</w:t>
@@ -14216,6 +14354,12 @@
     <w:p>
       <w:pPr>
         <w:pStyle w:val="BodyText"/>
+        <w:shd w:val="clear" w:color="auto" w:fill="F7F3E8"/>
+        <w:pBdr>
+          <w:left w:val="single" w:sz="24" w:space="10" w:color="B08625"/>
+        </w:pBdr>
+        <w:ind w:left="300"/>
+        <w:spacing/>
       </w:pPr>
       <w:r>
         <w:rPr>
@@ -14238,6 +14382,12 @@
     <w:p>
       <w:pPr>
         <w:pStyle w:val="BodyText"/>
+        <w:shd w:val="clear" w:color="auto" w:fill="F7F3E8"/>
+        <w:pBdr>
+          <w:left w:val="single" w:sz="24" w:space="10" w:color="B08625"/>
+        </w:pBdr>
+        <w:ind w:left="300"/>
+        <w:spacing/>
       </w:pPr>
       <w:r>
         <w:rPr>
@@ -15465,6 +15615,12 @@
     <w:p>
       <w:pPr>
         <w:pStyle w:val="BodyText"/>
+        <w:shd w:val="clear" w:color="auto" w:fill="F7F3E8"/>
+        <w:pBdr>
+          <w:left w:val="single" w:sz="24" w:space="10" w:color="B08625"/>
+        </w:pBdr>
+        <w:ind w:left="300"/>
+        <w:spacing w:after="0"/>
       </w:pPr>
       <w:r>
         <w:rPr>
@@ -15481,6 +15637,12 @@
     <w:p>
       <w:pPr>
         <w:pStyle w:val="BodyText"/>
+        <w:shd w:val="clear" w:color="auto" w:fill="F7F3E8"/>
+        <w:pBdr>
+          <w:left w:val="single" w:sz="24" w:space="10" w:color="B08625"/>
+        </w:pBdr>
+        <w:ind w:left="300"/>
+        <w:spacing w:before="0"/>
       </w:pPr>
       <w:r>
         <w:t xml:space="preserve">Program completion rate by track; Fast-Track utilization rate; zero-credit-loss audit pass rate (target 100%); cumulative enrolments vs. 18,333 ten-year target; secular-program enrolment share post-2038; 5-year external review completion rate per college.</w:t>
@@ -15489,6 +15651,12 @@
     <w:p>
       <w:pPr>
         <w:pStyle w:val="BodyText"/>
+        <w:shd w:val="clear" w:color="auto" w:fill="F7F3E8"/>
+        <w:pBdr>
+          <w:left w:val="single" w:sz="24" w:space="10" w:color="B08625"/>
+        </w:pBdr>
+        <w:ind w:left="300"/>
+        <w:spacing/>
       </w:pPr>
       <w:r>
         <w:rPr>
@@ -16604,6 +16772,12 @@
     <w:p>
       <w:pPr>
         <w:pStyle w:val="BodyText"/>
+        <w:shd w:val="clear" w:color="auto" w:fill="F7F3E8"/>
+        <w:pBdr>
+          <w:left w:val="single" w:sz="24" w:space="10" w:color="B08625"/>
+        </w:pBdr>
+        <w:ind w:left="300"/>
+        <w:spacing w:after="0"/>
       </w:pPr>
       <w:r>
         <w:rPr>
@@ -16620,6 +16794,12 @@
     <w:p>
       <w:pPr>
         <w:pStyle w:val="BodyText"/>
+        <w:shd w:val="clear" w:color="auto" w:fill="F7F3E8"/>
+        <w:pBdr>
+          <w:left w:val="single" w:sz="24" w:space="10" w:color="B08625"/>
+        </w:pBdr>
+        <w:ind w:left="300"/>
+        <w:spacing w:before="0"/>
       </w:pPr>
       <w:r>
         <w:t xml:space="preserve">Cost-per-credit-hour by college; shared-core utilization rate (% of eligible students enrolled); secular-school gen-ed completion rate; college-level enrolment share vs. Master Plan targets.</w:t>
@@ -16628,6 +16808,12 @@
     <w:p>
       <w:pPr>
         <w:pStyle w:val="BodyText"/>
+        <w:shd w:val="clear" w:color="auto" w:fill="F7F3E8"/>
+        <w:pBdr>
+          <w:left w:val="single" w:sz="24" w:space="10" w:color="B08625"/>
+        </w:pBdr>
+        <w:ind w:left="300"/>
+        <w:spacing/>
       </w:pPr>
       <w:r>
         <w:rPr>
@@ -17673,6 +17859,12 @@
     <w:p>
       <w:pPr>
         <w:pStyle w:val="BodyText"/>
+        <w:shd w:val="clear" w:color="auto" w:fill="F7F3E8"/>
+        <w:pBdr>
+          <w:left w:val="single" w:sz="24" w:space="10" w:color="B08625"/>
+        </w:pBdr>
+        <w:ind w:left="300"/>
+        <w:spacing w:after="0"/>
       </w:pPr>
       <w:r>
         <w:rPr>
@@ -17689,6 +17881,12 @@
     <w:p>
       <w:pPr>
         <w:pStyle w:val="BodyText"/>
+        <w:shd w:val="clear" w:color="auto" w:fill="F7F3E8"/>
+        <w:pBdr>
+          <w:left w:val="single" w:sz="24" w:space="10" w:color="B08625"/>
+        </w:pBdr>
+        <w:ind w:left="300"/>
+        <w:spacing w:before="0"/>
       </w:pPr>
       <w:r>
         <w:t xml:space="preserve">Faculty-to-student ratio by college; % faculty with verified credentials on file; promotion cycle completion time; honorarium-per-CH trend vs. revenue growth (should track proportionally, not lag).</w:t>
@@ -17697,6 +17895,12 @@
     <w:p>
       <w:pPr>
         <w:pStyle w:val="BodyText"/>
+        <w:shd w:val="clear" w:color="auto" w:fill="F7F3E8"/>
+        <w:pBdr>
+          <w:left w:val="single" w:sz="24" w:space="10" w:color="B08625"/>
+        </w:pBdr>
+        <w:ind w:left="300"/>
+        <w:spacing/>
       </w:pPr>
       <w:r>
         <w:rPr>
@@ -18506,6 +18710,12 @@
     <w:p>
       <w:pPr>
         <w:pStyle w:val="BodyText"/>
+        <w:shd w:val="clear" w:color="auto" w:fill="F7F3E8"/>
+        <w:pBdr>
+          <w:left w:val="single" w:sz="24" w:space="10" w:color="B08625"/>
+        </w:pBdr>
+        <w:ind w:left="300"/>
+        <w:spacing w:after="0"/>
       </w:pPr>
       <w:r>
         <w:rPr>
@@ -18522,6 +18732,12 @@
     <w:p>
       <w:pPr>
         <w:pStyle w:val="BodyText"/>
+        <w:shd w:val="clear" w:color="auto" w:fill="F7F3E8"/>
+        <w:pBdr>
+          <w:left w:val="single" w:sz="24" w:space="10" w:color="B08625"/>
+        </w:pBdr>
+        <w:ind w:left="300"/>
+        <w:spacing w:before="0"/>
       </w:pPr>
       <w:r>
         <w:t xml:space="preserve">Cost-per-CH by department; adjunct-to-HoD ratio; department-level program completion rate; time from School proposal to Senate approval for new secular departments (target &lt;2 semesters).</w:t>
@@ -18530,6 +18746,12 @@
     <w:p>
       <w:pPr>
         <w:pStyle w:val="BodyText"/>
+        <w:shd w:val="clear" w:color="auto" w:fill="F7F3E8"/>
+        <w:pBdr>
+          <w:left w:val="single" w:sz="24" w:space="10" w:color="B08625"/>
+        </w:pBdr>
+        <w:ind w:left="300"/>
+        <w:spacing/>
       </w:pPr>
       <w:r>
         <w:rPr>
@@ -19546,6 +19768,12 @@
     <w:p>
       <w:pPr>
         <w:pStyle w:val="BodyText"/>
+        <w:shd w:val="clear" w:color="auto" w:fill="F7F3E8"/>
+        <w:pBdr>
+          <w:left w:val="single" w:sz="24" w:space="10" w:color="B08625"/>
+        </w:pBdr>
+        <w:ind w:left="300"/>
+        <w:spacing w:after="0"/>
       </w:pPr>
       <w:r>
         <w:rPr>
@@ -19566,6 +19794,12 @@
           <w:numId w:val="1009"/>
         </w:numPr>
         <w:pStyle w:val="Compact"/>
+        <w:shd w:val="clear" w:color="auto" w:fill="F7F3E8"/>
+        <w:pBdr>
+          <w:left w:val="single" w:sz="24" w:space="10" w:color="B08625"/>
+        </w:pBdr>
+        <w:ind w:left="300"/>
+        <w:spacing w:before="0" w:after="0"/>
       </w:pPr>
       <w:r>
         <w:t xml:space="preserve">No single tier exceeds ~45% of total enrolled headcount (ladder-balance guardrail)</w:t>
@@ -19578,6 +19812,12 @@
           <w:numId w:val="1009"/>
         </w:numPr>
         <w:pStyle w:val="Compact"/>
+        <w:shd w:val="clear" w:color="auto" w:fill="F7F3E8"/>
+        <w:pBdr>
+          <w:left w:val="single" w:sz="24" w:space="10" w:color="B08625"/>
+        </w:pBdr>
+        <w:ind w:left="300"/>
+        <w:spacing w:before="0" w:after="0"/>
       </w:pPr>
       <w:r>
         <w:t xml:space="preserve">100% of active programs reviewed on a rolling 3–5-year cycle</w:t>
@@ -19590,6 +19830,12 @@
           <w:numId w:val="1009"/>
         </w:numPr>
         <w:pStyle w:val="Compact"/>
+        <w:shd w:val="clear" w:color="auto" w:fill="F7F3E8"/>
+        <w:pBdr>
+          <w:left w:val="single" w:sz="24" w:space="10" w:color="B08625"/>
+        </w:pBdr>
+        <w:ind w:left="300"/>
+        <w:spacing w:before="0" w:after="0"/>
       </w:pPr>
       <w:r>
         <w:t xml:space="preserve">Median Senate turnaround on new-program proposals &lt; 180 days</w:t>
@@ -19602,6 +19848,12 @@
           <w:numId w:val="1009"/>
         </w:numPr>
         <w:pStyle w:val="Compact"/>
+        <w:shd w:val="clear" w:color="auto" w:fill="F7F3E8"/>
+        <w:pBdr>
+          <w:left w:val="single" w:sz="24" w:space="10" w:color="B08625"/>
+        </w:pBdr>
+        <w:ind w:left="300"/>
+        <w:spacing w:before="0"/>
       </w:pPr>
       <w:r>
         <w:t xml:space="preserve">≤5% of programs below minimum-viable-cohort threshold for 2 consecutive years without a corrective plan</w:t>
@@ -21105,6 +21357,12 @@
     <w:p>
       <w:pPr>
         <w:pStyle w:val="BodyText"/>
+        <w:shd w:val="clear" w:color="auto" w:fill="F7F3E8"/>
+        <w:pBdr>
+          <w:left w:val="single" w:sz="24" w:space="10" w:color="B08625"/>
+        </w:pBdr>
+        <w:ind w:left="300"/>
+        <w:spacing w:after="0"/>
       </w:pPr>
       <w:r>
         <w:rPr>
@@ -21121,6 +21379,12 @@
     <w:p>
       <w:pPr>
         <w:pStyle w:val="BodyText"/>
+        <w:shd w:val="clear" w:color="auto" w:fill="F7F3E8"/>
+        <w:pBdr>
+          <w:left w:val="single" w:sz="24" w:space="10" w:color="B08625"/>
+        </w:pBdr>
+        <w:ind w:left="300"/>
+        <w:spacing w:before="0"/>
       </w:pPr>
       <w:r>
         <w:t xml:space="preserve">100% Sanad Audit completion before course activation; 100% programs with a current curriculum map; Fast-Track uptake rate tracked but capped by pass-rate integrity (no volume target); EMI placement-test pass rate trend.</w:t>
@@ -22376,6 +22640,12 @@
     <w:p>
       <w:pPr>
         <w:pStyle w:val="BodyText"/>
+        <w:shd w:val="clear" w:color="auto" w:fill="F7F3E8"/>
+        <w:pBdr>
+          <w:left w:val="single" w:sz="24" w:space="10" w:color="B08625"/>
+        </w:pBdr>
+        <w:ind w:left="300"/>
+        <w:spacing w:after="0"/>
       </w:pPr>
       <w:r>
         <w:rPr>
@@ -22392,6 +22662,12 @@
     <w:p>
       <w:pPr>
         <w:pStyle w:val="BodyText"/>
+        <w:shd w:val="clear" w:color="auto" w:fill="F7F3E8"/>
+        <w:pBdr>
+          <w:left w:val="single" w:sz="24" w:space="10" w:color="B08625"/>
+        </w:pBdr>
+        <w:ind w:left="300"/>
+        <w:spacing w:before="0"/>
       </w:pPr>
       <w:r>
         <w:t xml:space="preserve">Inquiry-to-enrollment conversion rate; application-processing SLA (&lt;10 business days); Fast-Track review turnaround; retention consistent with modeled attrition (8%/yr BA &amp; MA, 5%/yr PhD, low-attrition single-cycle for Diploma/Associate/HPGD/Post-Doc); alumni re-stacking rate to next tier.</w:t>
@@ -23485,6 +23761,12 @@
     <w:p>
       <w:pPr>
         <w:pStyle w:val="BodyText"/>
+        <w:shd w:val="clear" w:color="auto" w:fill="F7F3E8"/>
+        <w:pBdr>
+          <w:left w:val="single" w:sz="24" w:space="10" w:color="B08625"/>
+        </w:pBdr>
+        <w:ind w:left="300"/>
+        <w:spacing/>
       </w:pPr>
       <w:r>
         <w:rPr>
@@ -24511,6 +24793,12 @@
     <w:p>
       <w:pPr>
         <w:pStyle w:val="BodyText"/>
+        <w:shd w:val="clear" w:color="auto" w:fill="F7F3E8"/>
+        <w:pBdr>
+          <w:left w:val="single" w:sz="24" w:space="10" w:color="B08625"/>
+        </w:pBdr>
+        <w:ind w:left="300"/>
+        <w:spacing w:after="0"/>
       </w:pPr>
       <w:r>
         <w:rPr>
@@ -24527,6 +24815,12 @@
     <w:p>
       <w:pPr>
         <w:pStyle w:val="BodyText"/>
+        <w:shd w:val="clear" w:color="auto" w:fill="F7F3E8"/>
+        <w:pBdr>
+          <w:left w:val="single" w:sz="24" w:space="10" w:color="B08625"/>
+        </w:pBdr>
+        <w:ind w:left="300"/>
+        <w:spacing w:before="0"/>
       </w:pPr>
       <w:r>
         <w:t xml:space="preserve">100% isnād/ijāza (or terminal-degree) verification completed before appointment; faculty:student ratio maintained per tier; madhhab-representation balance tracked annually; Honoraria budget adherence to the 40%-of-Payroll ratio; faculty retention rate.</w:t>
@@ -25609,6 +25903,12 @@
     <w:p>
       <w:pPr>
         <w:pStyle w:val="BodyText"/>
+        <w:shd w:val="clear" w:color="auto" w:fill="F7F3E8"/>
+        <w:pBdr>
+          <w:left w:val="single" w:sz="24" w:space="10" w:color="B08625"/>
+        </w:pBdr>
+        <w:ind w:left="300"/>
+        <w:spacing/>
       </w:pPr>
       <w:r>
         <w:rPr>
@@ -26493,6 +26793,12 @@
     <w:p>
       <w:pPr>
         <w:pStyle w:val="BodyText"/>
+        <w:shd w:val="clear" w:color="auto" w:fill="F7F3E8"/>
+        <w:pBdr>
+          <w:left w:val="single" w:sz="24" w:space="10" w:color="B08625"/>
+        </w:pBdr>
+        <w:ind w:left="300"/>
+        <w:spacing/>
       </w:pPr>
       <w:r>
         <w:rPr>
@@ -27321,6 +27627,12 @@
     <w:p>
       <w:pPr>
         <w:pStyle w:val="BodyText"/>
+        <w:shd w:val="clear" w:color="auto" w:fill="F7F3E8"/>
+        <w:pBdr>
+          <w:left w:val="single" w:sz="24" w:space="10" w:color="B08625"/>
+        </w:pBdr>
+        <w:ind w:left="300"/>
+        <w:spacing/>
       </w:pPr>
       <w:r>
         <w:rPr>
@@ -28208,6 +28520,12 @@
     <w:p>
       <w:pPr>
         <w:pStyle w:val="BodyText"/>
+        <w:shd w:val="clear" w:color="auto" w:fill="F7F3E8"/>
+        <w:pBdr>
+          <w:left w:val="single" w:sz="24" w:space="10" w:color="B08625"/>
+        </w:pBdr>
+        <w:ind w:left="300"/>
+        <w:spacing/>
       </w:pPr>
       <w:r>
         <w:rPr>
@@ -28227,6 +28545,12 @@
     <w:p>
       <w:pPr>
         <w:pStyle w:val="BodyText"/>
+        <w:shd w:val="clear" w:color="auto" w:fill="F7F3E8"/>
+        <w:pBdr>
+          <w:left w:val="single" w:sz="24" w:space="10" w:color="B08625"/>
+        </w:pBdr>
+        <w:ind w:left="300"/>
+        <w:spacing/>
       </w:pPr>
       <w:r>
         <w:rPr>
@@ -29021,6 +29345,12 @@
     <w:p>
       <w:pPr>
         <w:pStyle w:val="BodyText"/>
+        <w:shd w:val="clear" w:color="auto" w:fill="F7F3E8"/>
+        <w:pBdr>
+          <w:left w:val="single" w:sz="24" w:space="10" w:color="B08625"/>
+        </w:pBdr>
+        <w:ind w:left="300"/>
+        <w:spacing/>
       </w:pPr>
       <w:r>
         <w:rPr>
@@ -30238,6 +30568,12 @@
     <w:p>
       <w:pPr>
         <w:pStyle w:val="BodyText"/>
+        <w:shd w:val="clear" w:color="auto" w:fill="F7F3E8"/>
+        <w:pBdr>
+          <w:left w:val="single" w:sz="24" w:space="10" w:color="B08625"/>
+        </w:pBdr>
+        <w:ind w:left="300"/>
+        <w:spacing w:after="0"/>
       </w:pPr>
       <w:r>
         <w:rPr>
@@ -30254,6 +30590,12 @@
     <w:p>
       <w:pPr>
         <w:pStyle w:val="BodyText"/>
+        <w:shd w:val="clear" w:color="auto" w:fill="F7F3E8"/>
+        <w:pBdr>
+          <w:left w:val="single" w:sz="24" w:space="10" w:color="B08625"/>
+        </w:pBdr>
+        <w:ind w:left="300"/>
+        <w:spacing w:before="0"/>
       </w:pPr>
       <w:r>
         <w:t xml:space="preserve">Platform uptime (target ≥99% by Year 5); course-completion rate by tuition tier; mobile session share (target majority in Tier 3/4 regions); payment success rate per gateway; course-authoring throughput against the 71+28 catalog target.</w:t>
@@ -30262,6 +30604,12 @@
     <w:p>
       <w:pPr>
         <w:pStyle w:val="BodyText"/>
+        <w:shd w:val="clear" w:color="auto" w:fill="F7F3E8"/>
+        <w:pBdr>
+          <w:left w:val="single" w:sz="24" w:space="10" w:color="B08625"/>
+        </w:pBdr>
+        <w:ind w:left="300"/>
+        <w:spacing w:after="0"/>
       </w:pPr>
       <w:r>
         <w:rPr>
@@ -30278,6 +30626,12 @@
     <w:p>
       <w:pPr>
         <w:pStyle w:val="BodyText"/>
+        <w:shd w:val="clear" w:color="auto" w:fill="F7F3E8"/>
+        <w:pBdr>
+          <w:left w:val="single" w:sz="24" w:space="10" w:color="B08625"/>
+        </w:pBdr>
+        <w:ind w:left="300"/>
+        <w:spacing w:before="0"/>
       </w:pPr>
       <w:r>
         <w:t xml:space="preserve">Regional payment-gateway disruption (existing register risk, MODERATE/MEDIUM) — mitigated by redundant regional gateways plus bank-transfer fallback, already codified. Single-host failure risk in Year 1 — mitigated by managed-hosting SLA and scheduled backups. Low-bandwidth attrition in Tier 3/4 regions — mitigated by mobile-first, text/audio-prioritized content design. Vendor lock-in — mitigated by open-source core (Moodle) with data portability requirements in any hosting contract.</w:t>
@@ -31102,6 +31456,12 @@
     <w:p>
       <w:pPr>
         <w:pStyle w:val="BodyText"/>
+        <w:shd w:val="clear" w:color="auto" w:fill="F7F3E8"/>
+        <w:pBdr>
+          <w:left w:val="single" w:sz="24" w:space="10" w:color="B08625"/>
+        </w:pBdr>
+        <w:ind w:left="300"/>
+        <w:spacing w:after="0"/>
       </w:pPr>
       <w:r>
         <w:rPr>
@@ -31118,6 +31478,12 @@
     <w:p>
       <w:pPr>
         <w:pStyle w:val="BodyText"/>
+        <w:shd w:val="clear" w:color="auto" w:fill="F7F3E8"/>
+        <w:pBdr>
+          <w:left w:val="single" w:sz="24" w:space="10" w:color="B08625"/>
+        </w:pBdr>
+        <w:ind w:left="300"/>
+        <w:spacing w:before="0"/>
       </w:pPr>
       <w:r>
         <w:t xml:space="preserve">Chatbot query-resolution rate; Tajweed-tool adoption % among enrolled reciters; admissions processing-time reduction; faculty hours saved on content drafting; zero confirmed Sharī’ah-compliance violations.</w:t>
@@ -31126,6 +31492,12 @@
     <w:p>
       <w:pPr>
         <w:pStyle w:val="BodyText"/>
+        <w:shd w:val="clear" w:color="auto" w:fill="F7F3E8"/>
+        <w:pBdr>
+          <w:left w:val="single" w:sz="24" w:space="10" w:color="B08625"/>
+        </w:pBdr>
+        <w:ind w:left="300"/>
+        <w:spacing w:after="0"/>
       </w:pPr>
       <w:r>
         <w:rPr>
@@ -31142,6 +31514,12 @@
     <w:p>
       <w:pPr>
         <w:pStyle w:val="BodyText"/>
+        <w:shd w:val="clear" w:color="auto" w:fill="F7F3E8"/>
+        <w:pBdr>
+          <w:left w:val="single" w:sz="24" w:space="10" w:color="B08625"/>
+        </w:pBdr>
+        <w:ind w:left="300"/>
+        <w:spacing w:before="0"/>
       </w:pPr>
       <w:r>
         <w:t xml:space="preserve">Theological error/hallucination in religious-content tools (HIGH impact) — mitigated by mandatory Sharī’ah Advisory Board certification, human-in-the-loop review, and an explicit prohibition on autonomous fatwa- or tafsīr-generation. Voice-data privacy in recitation tools — mitigated by data-minimization and consent policy. Vendor dependency/API price shifts — mitigated by preferring usage-based, cancellable contracts. Budget overrun against the fixed 5% line — mitigated by Group IV pre-approval of any AI spend above $2,000/yr in Years 1–5.</w:t>
@@ -31822,6 +32200,12 @@
     <w:p>
       <w:pPr>
         <w:pStyle w:val="BodyText"/>
+        <w:shd w:val="clear" w:color="auto" w:fill="F7F3E8"/>
+        <w:pBdr>
+          <w:left w:val="single" w:sz="24" w:space="10" w:color="B08625"/>
+        </w:pBdr>
+        <w:ind w:left="300"/>
+        <w:spacing w:after="0"/>
       </w:pPr>
       <w:r>
         <w:rPr>
@@ -31838,6 +32222,12 @@
     <w:p>
       <w:pPr>
         <w:pStyle w:val="BodyText"/>
+        <w:shd w:val="clear" w:color="auto" w:fill="F7F3E8"/>
+        <w:pBdr>
+          <w:left w:val="single" w:sz="24" w:space="10" w:color="B08625"/>
+        </w:pBdr>
+        <w:ind w:left="300"/>
+        <w:spacing w:before="0"/>
       </w:pPr>
       <w:r>
         <w:t xml:space="preserve">System uptime; zero confirmed data-breach incidents; payment success rate; SIS-LMS data-integrity accuracy; average admissions processing time; annual security-audit pass rate (from Year 6 onward).</w:t>
@@ -31846,6 +32236,12 @@
     <w:p>
       <w:pPr>
         <w:pStyle w:val="BodyText"/>
+        <w:shd w:val="clear" w:color="auto" w:fill="F7F3E8"/>
+        <w:pBdr>
+          <w:left w:val="single" w:sz="24" w:space="10" w:color="B08625"/>
+        </w:pBdr>
+        <w:ind w:left="300"/>
+        <w:spacing w:after="0"/>
       </w:pPr>
       <w:r>
         <w:rPr>
@@ -31862,6 +32258,12 @@
     <w:p>
       <w:pPr>
         <w:pStyle w:val="BodyText"/>
+        <w:shd w:val="clear" w:color="auto" w:fill="F7F3E8"/>
+        <w:pBdr>
+          <w:left w:val="single" w:sz="24" w:space="10" w:color="B08625"/>
+        </w:pBdr>
+        <w:ind w:left="300"/>
+        <w:spacing w:before="0"/>
       </w:pPr>
       <w:r>
         <w:t xml:space="preserve">Cybersecurity breach exposing global student PII/payment data — mitigated by encryption at rest/in transit, MFA, PCI-compliant payment vendors, and a documented incident-response plan. Regional payment-gateway disruption (existing register risk) — mitigated by redundant gateways plus bank-transfer fallback. Thin-staffing talent scarcity — mitigated by outsourcing hosting/security-monitoring to managed providers in Years 1–7 rather than building in-house capacity prematurely. Technical debt/vendor lock-in as the stack matures — mitigated by preferring open standards (LTI, SCORM/xAPI, open APIs).</w:t>
@@ -32557,6 +32959,12 @@
     <w:p>
       <w:pPr>
         <w:pStyle w:val="BodyText"/>
+        <w:shd w:val="clear" w:color="auto" w:fill="F7F3E8"/>
+        <w:pBdr>
+          <w:left w:val="single" w:sz="24" w:space="10" w:color="B08625"/>
+        </w:pBdr>
+        <w:ind w:left="300"/>
+        <w:spacing w:after="0"/>
       </w:pPr>
       <w:r>
         <w:rPr>
@@ -32573,6 +32981,12 @@
     <w:p>
       <w:pPr>
         <w:pStyle w:val="BodyText"/>
+        <w:shd w:val="clear" w:color="auto" w:fill="F7F3E8"/>
+        <w:pBdr>
+          <w:left w:val="single" w:sz="24" w:space="10" w:color="B08625"/>
+        </w:pBdr>
+        <w:ind w:left="300"/>
+        <w:spacing w:before="0"/>
       </w:pPr>
       <w:r>
         <w:t xml:space="preserve">Digital catalog size (titles/volumes); monthly active library usage per student; subscription cost-per-active-user; faculty repository submission count; student research-skills assessment scores.</w:t>
@@ -32581,6 +32995,12 @@
     <w:p>
       <w:pPr>
         <w:pStyle w:val="BodyText"/>
+        <w:shd w:val="clear" w:color="auto" w:fill="F7F3E8"/>
+        <w:pBdr>
+          <w:left w:val="single" w:sz="24" w:space="10" w:color="B08625"/>
+        </w:pBdr>
+        <w:ind w:left="300"/>
+        <w:spacing w:after="0"/>
       </w:pPr>
       <w:r>
         <w:rPr>
@@ -32597,6 +33017,12 @@
     <w:p>
       <w:pPr>
         <w:pStyle w:val="BodyText"/>
+        <w:shd w:val="clear" w:color="auto" w:fill="F7F3E8"/>
+        <w:pBdr>
+          <w:left w:val="single" w:sz="24" w:space="10" w:color="B08625"/>
+        </w:pBdr>
+        <w:ind w:left="300"/>
+        <w:spacing w:before="0"/>
       </w:pPr>
       <w:r>
         <w:t xml:space="preserve">Licensing cost creep against a thin budget — mitigated by an open-access-first acquisition policy and consortium negotiation before any paid subscription. Arabic-script digitization/OCR quality issues — mitigated by prioritizing vendor-digitized sources over in-house OCR in early years. Low-bandwidth access barriers — mitigated by text-first, compressed formats. Nigeria physical library timing depends on sovereign NUC/National Assembly processes outside AMIU’s control (existing register risk) — mitigated by treating the Year-10 target as milestone-contingent while the digital collection continues uninterrupted regardless of charter timing.</w:t>
@@ -33493,6 +33919,12 @@
     <w:p>
       <w:pPr>
         <w:pStyle w:val="BodyText"/>
+        <w:shd w:val="clear" w:color="auto" w:fill="F7F3E8"/>
+        <w:pBdr>
+          <w:left w:val="single" w:sz="24" w:space="10" w:color="B08625"/>
+        </w:pBdr>
+        <w:ind w:left="300"/>
+        <w:spacing w:after="0"/>
       </w:pPr>
       <w:r>
         <w:rPr>
@@ -33509,6 +33941,12 @@
     <w:p>
       <w:pPr>
         <w:pStyle w:val="BodyText"/>
+        <w:shd w:val="clear" w:color="auto" w:fill="F7F3E8"/>
+        <w:pBdr>
+          <w:left w:val="single" w:sz="24" w:space="10" w:color="B08625"/>
+        </w:pBdr>
+        <w:ind w:left="300"/>
+        <w:spacing w:before="0"/>
       </w:pPr>
       <w:r>
         <w:t xml:space="preserve">Beneficiaries served (schools/mosques, widows/orphans, scholarship recipients); Strategic Business Reserve annual Sharī’ah-compliant return rate; reserve balance trajectory versus the $1,240,527 Year-10 benchmark; 100% compliance rate on the &gt;$250,000 deployment-vote threshold; zero Sharī’ah non-compliance findings.</w:t>
@@ -33517,6 +33955,12 @@
     <w:p>
       <w:pPr>
         <w:pStyle w:val="BodyText"/>
+        <w:shd w:val="clear" w:color="auto" w:fill="F7F3E8"/>
+        <w:pBdr>
+          <w:left w:val="single" w:sz="24" w:space="10" w:color="B08625"/>
+        </w:pBdr>
+        <w:ind w:left="300"/>
+        <w:spacing w:after="0"/>
       </w:pPr>
       <w:r>
         <w:rPr>
@@ -33533,6 +33977,12 @@
     <w:p>
       <w:pPr>
         <w:pStyle w:val="BodyText"/>
+        <w:shd w:val="clear" w:color="auto" w:fill="F7F3E8"/>
+        <w:pBdr>
+          <w:left w:val="single" w:sz="24" w:space="10" w:color="B08625"/>
+        </w:pBdr>
+        <w:ind w:left="300"/>
+        <w:spacing w:before="0"/>
       </w:pPr>
       <w:r>
         <w:t xml:space="preserve">Sharī’ah-compliance risk in retained-reserve investment (existing register pattern, LOW likelihood/HIGH impact) — mitigated by Independent Sharī’ah Advisory Board bi-annual re-certification of all instruments. Concentration risk while the reserve is small — mitigated by conservative, low-risk Islamic instruments until scale supports diversification. Ad hoc/undisciplined deployment — mitigated by the fixed $250,000 two-thirds/two-independent-seat vote threshold. Nigeria Mega-University Reserve dependent on sovereign Nigerian accreditation processes outside AMIU’s control (existing register risk) — mitigated by ring-fencing the sub-line regardless of charter timing, with Senate-vote redeployment to scholarship/emergency lines possible if the Nigeria timeline slips. Nonprofit/for-profit commingling scrutiny (existing register risk) — mitigated by strict account segregation from any Commercial Engine activity and arm’s-length documentation for any shared services.</w:t>
@@ -34684,6 +35134,12 @@
     <w:p>
       <w:pPr>
         <w:pStyle w:val="BodyText"/>
+        <w:shd w:val="clear" w:color="auto" w:fill="F7F3E8"/>
+        <w:pBdr>
+          <w:left w:val="single" w:sz="24" w:space="10" w:color="B08625"/>
+        </w:pBdr>
+        <w:ind w:left="300"/>
+        <w:spacing/>
       </w:pPr>
       <w:r>
         <w:rPr>
@@ -34706,6 +35162,12 @@
     <w:p>
       <w:pPr>
         <w:pStyle w:val="BodyText"/>
+        <w:shd w:val="clear" w:color="auto" w:fill="F7F3E8"/>
+        <w:pBdr>
+          <w:left w:val="single" w:sz="24" w:space="10" w:color="B08625"/>
+        </w:pBdr>
+        <w:ind w:left="300"/>
+        <w:spacing/>
       </w:pPr>
       <w:r>
         <w:rPr>
@@ -35339,6 +35801,12 @@
     <w:p>
       <w:pPr>
         <w:pStyle w:val="BodyText"/>
+        <w:shd w:val="clear" w:color="auto" w:fill="F7F3E8"/>
+        <w:pBdr>
+          <w:left w:val="single" w:sz="24" w:space="10" w:color="B08625"/>
+        </w:pBdr>
+        <w:ind w:left="300"/>
+        <w:spacing/>
       </w:pPr>
       <w:r>
         <w:rPr>
@@ -35361,6 +35829,12 @@
     <w:p>
       <w:pPr>
         <w:pStyle w:val="BodyText"/>
+        <w:shd w:val="clear" w:color="auto" w:fill="F7F3E8"/>
+        <w:pBdr>
+          <w:left w:val="single" w:sz="24" w:space="10" w:color="B08625"/>
+        </w:pBdr>
+        <w:ind w:left="300"/>
+        <w:spacing/>
       </w:pPr>
       <w:r>
         <w:rPr>
@@ -36165,6 +36639,12 @@
     <w:p>
       <w:pPr>
         <w:pStyle w:val="BodyText"/>
+        <w:shd w:val="clear" w:color="auto" w:fill="F7F3E8"/>
+        <w:pBdr>
+          <w:left w:val="single" w:sz="24" w:space="10" w:color="B08625"/>
+        </w:pBdr>
+        <w:ind w:left="300"/>
+        <w:spacing/>
       </w:pPr>
       <w:r>
         <w:rPr>
@@ -36187,6 +36667,12 @@
     <w:p>
       <w:pPr>
         <w:pStyle w:val="BodyText"/>
+        <w:shd w:val="clear" w:color="auto" w:fill="F7F3E8"/>
+        <w:pBdr>
+          <w:left w:val="single" w:sz="24" w:space="10" w:color="B08625"/>
+        </w:pBdr>
+        <w:ind w:left="300"/>
+        <w:spacing/>
       </w:pPr>
       <w:r>
         <w:rPr>
@@ -36941,6 +37427,12 @@
     <w:p>
       <w:pPr>
         <w:pStyle w:val="BodyText"/>
+        <w:shd w:val="clear" w:color="auto" w:fill="F7F3E8"/>
+        <w:pBdr>
+          <w:left w:val="single" w:sz="24" w:space="10" w:color="B08625"/>
+        </w:pBdr>
+        <w:ind w:left="300"/>
+        <w:spacing/>
       </w:pPr>
       <w:r>
         <w:rPr>
@@ -36963,6 +37455,12 @@
     <w:p>
       <w:pPr>
         <w:pStyle w:val="BodyText"/>
+        <w:shd w:val="clear" w:color="auto" w:fill="F7F3E8"/>
+        <w:pBdr>
+          <w:left w:val="single" w:sz="24" w:space="10" w:color="B08625"/>
+        </w:pBdr>
+        <w:ind w:left="300"/>
+        <w:spacing/>
       </w:pPr>
       <w:r>
         <w:rPr>
@@ -37872,6 +38370,12 @@
     <w:p>
       <w:pPr>
         <w:pStyle w:val="BodyText"/>
+        <w:shd w:val="clear" w:color="auto" w:fill="F7F3E8"/>
+        <w:pBdr>
+          <w:left w:val="single" w:sz="24" w:space="10" w:color="B08625"/>
+        </w:pBdr>
+        <w:ind w:left="300"/>
+        <w:spacing/>
       </w:pPr>
       <w:r>
         <w:rPr>
@@ -37894,6 +38398,12 @@
     <w:p>
       <w:pPr>
         <w:pStyle w:val="BodyText"/>
+        <w:shd w:val="clear" w:color="auto" w:fill="F7F3E8"/>
+        <w:pBdr>
+          <w:left w:val="single" w:sz="24" w:space="10" w:color="B08625"/>
+        </w:pBdr>
+        <w:ind w:left="300"/>
+        <w:spacing/>
       </w:pPr>
       <w:r>
         <w:rPr>
@@ -38718,6 +39228,12 @@
     <w:p>
       <w:pPr>
         <w:pStyle w:val="BodyText"/>
+        <w:shd w:val="clear" w:color="auto" w:fill="F7F3E8"/>
+        <w:pBdr>
+          <w:left w:val="single" w:sz="24" w:space="10" w:color="B08625"/>
+        </w:pBdr>
+        <w:ind w:left="300"/>
+        <w:spacing w:after="0"/>
       </w:pPr>
       <w:r>
         <w:rPr>
@@ -38734,6 +39250,12 @@
     <w:p>
       <w:pPr>
         <w:pStyle w:val="BodyText"/>
+        <w:shd w:val="clear" w:color="auto" w:fill="F7F3E8"/>
+        <w:pBdr>
+          <w:left w:val="single" w:sz="24" w:space="10" w:color="B08625"/>
+        </w:pBdr>
+        <w:ind w:left="300"/>
+        <w:spacing w:before="0"/>
       </w:pPr>
       <w:r>
         <w:t xml:space="preserve">Feasibility study completed (Year 3); CAC entity registered (Year 5); ≥3 documented NUC pre-consultation meetings (by Year 8); site option agreement(s) signed (Year 8); charter application formally submitted (Year 10); Reserve balance tracked against $333,383 cumulative target.</w:t>
@@ -38742,6 +39264,12 @@
     <w:p>
       <w:pPr>
         <w:pStyle w:val="BodyText"/>
+        <w:shd w:val="clear" w:color="auto" w:fill="F7F3E8"/>
+        <w:pBdr>
+          <w:left w:val="single" w:sz="24" w:space="10" w:color="B08625"/>
+        </w:pBdr>
+        <w:ind w:left="300"/>
+        <w:spacing w:after="0"/>
       </w:pPr>
       <w:r>
         <w:rPr>
@@ -38758,6 +39286,12 @@
     <w:p>
       <w:pPr>
         <w:pStyle w:val="BodyText"/>
+        <w:shd w:val="clear" w:color="auto" w:fill="F7F3E8"/>
+        <w:pBdr>
+          <w:left w:val="single" w:sz="24" w:space="10" w:color="B08625"/>
+        </w:pBdr>
+        <w:ind w:left="300"/>
+        <w:spacing w:before="0"/>
       </w:pPr>
       <w:r>
         <w:t xml:space="preserve">Per the adopted risk register:</w:t>
@@ -39431,6 +39965,12 @@
     <w:p>
       <w:pPr>
         <w:pStyle w:val="BodyText"/>
+        <w:shd w:val="clear" w:color="auto" w:fill="F7F3E8"/>
+        <w:pBdr>
+          <w:left w:val="single" w:sz="24" w:space="10" w:color="B08625"/>
+        </w:pBdr>
+        <w:ind w:left="300"/>
+        <w:spacing w:after="0"/>
       </w:pPr>
       <w:r>
         <w:rPr>
@@ -39447,6 +39987,12 @@
     <w:p>
       <w:pPr>
         <w:pStyle w:val="BodyText"/>
+        <w:shd w:val="clear" w:color="auto" w:fill="F7F3E8"/>
+        <w:pBdr>
+          <w:left w:val="single" w:sz="24" w:space="10" w:color="B08625"/>
+        </w:pBdr>
+        <w:ind w:left="300"/>
+        <w:spacing w:before="0"/>
       </w:pPr>
       <w:r>
         <w:t xml:space="preserve">Gulf-origin enrolment as % of Tier 1 total; Gulf revenue contribution to Tier 2–4 cross-subsidy pool; number of mosque/Islamic-school MOUs signed; count and value of Gulf-origin Sadaqah Jāriyah gifts; ministry engagement meetings logged; first recognition agreement secured Year 13.</w:t>
@@ -39455,6 +40001,12 @@
     <w:p>
       <w:pPr>
         <w:pStyle w:val="BodyText"/>
+        <w:shd w:val="clear" w:color="auto" w:fill="F7F3E8"/>
+        <w:pBdr>
+          <w:left w:val="single" w:sz="24" w:space="10" w:color="B08625"/>
+        </w:pBdr>
+        <w:ind w:left="300"/>
+        <w:spacing w:after="0"/>
       </w:pPr>
       <w:r>
         <w:rPr>
@@ -39471,6 +40023,12 @@
     <w:p>
       <w:pPr>
         <w:pStyle w:val="BodyText"/>
+        <w:shd w:val="clear" w:color="auto" w:fill="F7F3E8"/>
+        <w:pBdr>
+          <w:left w:val="single" w:sz="24" w:space="10" w:color="B08625"/>
+        </w:pBdr>
+        <w:ind w:left="300"/>
+        <w:spacing w:before="0"/>
       </w:pPr>
       <w:r>
         <w:t xml:space="preserve">Geopolitical/travel disruption in any single Gulf state — mitigated by targeting seven countries, not one. Competition from established Gulf-region universities — mitigated by AMIU’s stackable low-cost ladder as a differentiator. Recognition delay — mitigated identically to the Nigeria model: cross-subsidy tuition revenue and admissions operate independent of ministry recognition; delay does not threaten solvency.</w:t>
@@ -40043,6 +40601,12 @@
     <w:p>
       <w:pPr>
         <w:pStyle w:val="BodyText"/>
+        <w:shd w:val="clear" w:color="auto" w:fill="F7F3E8"/>
+        <w:pBdr>
+          <w:left w:val="single" w:sz="24" w:space="10" w:color="B08625"/>
+        </w:pBdr>
+        <w:ind w:left="300"/>
+        <w:spacing w:after="0"/>
       </w:pPr>
       <w:r>
         <w:rPr>
@@ -40059,6 +40623,12 @@
     <w:p>
       <w:pPr>
         <w:pStyle w:val="BodyText"/>
+        <w:shd w:val="clear" w:color="auto" w:fill="F7F3E8"/>
+        <w:pBdr>
+          <w:left w:val="single" w:sz="24" w:space="10" w:color="B08625"/>
+        </w:pBdr>
+        <w:ind w:left="300"/>
+        <w:spacing w:before="0"/>
       </w:pPr>
       <w:r>
         <w:t xml:space="preserve">LMS advising-portal usage rate; email/ticket response-time SLA (target: under 72 hours); hardship referrals resolved within the Waqf Scholarship Block’s 14-day adjudication window; accommodation requests processed; periodic student-satisfaction pulse survey participation.</w:t>
@@ -40067,6 +40637,12 @@
     <w:p>
       <w:pPr>
         <w:pStyle w:val="BodyText"/>
+        <w:shd w:val="clear" w:color="auto" w:fill="F7F3E8"/>
+        <w:pBdr>
+          <w:left w:val="single" w:sz="24" w:space="10" w:color="B08625"/>
+        </w:pBdr>
+        <w:ind w:left="300"/>
+        <w:spacing w:after="0"/>
       </w:pPr>
       <w:r>
         <w:rPr>
@@ -40083,6 +40659,12 @@
     <w:p>
       <w:pPr>
         <w:pStyle w:val="BodyText"/>
+        <w:shd w:val="clear" w:color="auto" w:fill="F7F3E8"/>
+        <w:pBdr>
+          <w:left w:val="single" w:sz="24" w:space="10" w:color="B08625"/>
+        </w:pBdr>
+        <w:ind w:left="300"/>
+        <w:spacing w:before="0"/>
       </w:pPr>
       <w:r>
         <w:t xml:space="preserve">Understaffing/burnout on volunteer chaplaincy faculty — mitigated by rotation and cap on volunteer hours. Inequitable access for low-connectivity students — mitigated with offline/print-friendly LMS materials. Premature promises of full-service support — mitigated by publishing the phased roadmap transparently to students so expectations match actual capacity at each phase.</w:t>
@@ -40648,6 +41230,12 @@
     <w:p>
       <w:pPr>
         <w:pStyle w:val="BodyText"/>
+        <w:shd w:val="clear" w:color="auto" w:fill="F7F3E8"/>
+        <w:pBdr>
+          <w:left w:val="single" w:sz="24" w:space="10" w:color="B08625"/>
+        </w:pBdr>
+        <w:ind w:left="300"/>
+        <w:spacing w:after="0"/>
       </w:pPr>
       <w:r>
         <w:rPr>
@@ -40664,6 +41252,12 @@
     <w:p>
       <w:pPr>
         <w:pStyle w:val="BodyText"/>
+        <w:shd w:val="clear" w:color="auto" w:fill="F7F3E8"/>
+        <w:pBdr>
+          <w:left w:val="single" w:sz="24" w:space="10" w:color="B08625"/>
+        </w:pBdr>
+        <w:ind w:left="300"/>
+        <w:spacing w:before="0"/>
       </w:pPr>
       <w:r>
         <w:t xml:space="preserve">% of each graduating cohort joining the alumni community; alumni-referral-driven new enrolments; alumni giving participation rate; mosque nominations sourced through alumni ambassadors; number of active regional alumni chapters/reps.</w:t>
@@ -40672,6 +41266,12 @@
     <w:p>
       <w:pPr>
         <w:pStyle w:val="BodyText"/>
+        <w:shd w:val="clear" w:color="auto" w:fill="F7F3E8"/>
+        <w:pBdr>
+          <w:left w:val="single" w:sz="24" w:space="10" w:color="B08625"/>
+        </w:pBdr>
+        <w:ind w:left="300"/>
+        <w:spacing w:after="0"/>
       </w:pPr>
       <w:r>
         <w:rPr>
@@ -40688,6 +41288,12 @@
     <w:p>
       <w:pPr>
         <w:pStyle w:val="BodyText"/>
+        <w:shd w:val="clear" w:color="auto" w:fill="F7F3E8"/>
+        <w:pBdr>
+          <w:left w:val="single" w:sz="24" w:space="10" w:color="B08625"/>
+        </w:pBdr>
+        <w:ind w:left="300"/>
+        <w:spacing w:before="0"/>
       </w:pPr>
       <w:r>
         <w:t xml:space="preserve">Early-cohort disengagement (small numbers, no track record) — mitigated by automatic LMS/WhatsApp opt-in at graduation rather than opt-in recruitment. CRM/data sprawl — mitigated by a single lightweight tool integrated into the existing LMS rather than a separate platform. Volunteer-ambassador burnout — mitigated by modest referral incentives funded from Marketing.</w:t>
@@ -41253,6 +41859,12 @@
     <w:p>
       <w:pPr>
         <w:pStyle w:val="BodyText"/>
+        <w:shd w:val="clear" w:color="auto" w:fill="F7F3E8"/>
+        <w:pBdr>
+          <w:left w:val="single" w:sz="24" w:space="10" w:color="B08625"/>
+        </w:pBdr>
+        <w:ind w:left="300"/>
+        <w:spacing w:after="0"/>
       </w:pPr>
       <w:r>
         <w:rPr>
@@ -41269,6 +41881,12 @@
     <w:p>
       <w:pPr>
         <w:pStyle w:val="BodyText"/>
+        <w:shd w:val="clear" w:color="auto" w:fill="F7F3E8"/>
+        <w:pBdr>
+          <w:left w:val="single" w:sz="24" w:space="10" w:color="B08625"/>
+        </w:pBdr>
+        <w:ind w:left="300"/>
+        <w:spacing w:before="0"/>
       </w:pPr>
       <w:r>
         <w:t xml:space="preserve">Placement rate within 6/12 months, tracked separately for religious-vocation vs. secular tracks; count of mosque/employer/Islamic-finance MOUs; further-study conversion rate up the credential ladder; Waqf Administration college graduate placements in Islamic finance; post-Year-11 secular placement rate as that data becomes available.</w:t>
@@ -41277,6 +41895,12 @@
     <w:p>
       <w:pPr>
         <w:pStyle w:val="BodyText"/>
+        <w:shd w:val="clear" w:color="auto" w:fill="F7F3E8"/>
+        <w:pBdr>
+          <w:left w:val="single" w:sz="24" w:space="10" w:color="B08625"/>
+        </w:pBdr>
+        <w:ind w:left="300"/>
+        <w:spacing w:after="0"/>
       </w:pPr>
       <w:r>
         <w:rPr>
@@ -41293,6 +41917,12 @@
     <w:p>
       <w:pPr>
         <w:pStyle w:val="BodyText"/>
+        <w:shd w:val="clear" w:color="auto" w:fill="F7F3E8"/>
+        <w:pBdr>
+          <w:left w:val="single" w:sz="24" w:space="10" w:color="B08625"/>
+        </w:pBdr>
+        <w:ind w:left="300"/>
+        <w:spacing w:before="0"/>
       </w:pPr>
       <w:r>
         <w:t xml:space="preserve">Limited labor-market data for religious-vocation roles — mitigated by direct outcome surveys of graduates rather than reliance on external labor statistics. Thin secular-market employer relationships at each new school’s launch — mitigated by beginning employer-partnership building</w:t>
@@ -43015,6 +43645,12 @@
     <w:p>
       <w:pPr>
         <w:pStyle w:val="BodyText"/>
+        <w:shd w:val="clear" w:color="auto" w:fill="F7F3E8"/>
+        <w:pBdr>
+          <w:left w:val="single" w:sz="24" w:space="10" w:color="B08625"/>
+        </w:pBdr>
+        <w:ind w:left="300"/>
+        <w:spacing w:after="0"/>
       </w:pPr>
       <w:r>
         <w:rPr>
@@ -43031,6 +43667,12 @@
     <w:p>
       <w:pPr>
         <w:pStyle w:val="BodyText"/>
+        <w:shd w:val="clear" w:color="auto" w:fill="F7F3E8"/>
+        <w:pBdr>
+          <w:left w:val="single" w:sz="24" w:space="10" w:color="B08625"/>
+        </w:pBdr>
+        <w:ind w:left="300"/>
+        <w:spacing w:before="0"/>
       </w:pPr>
       <w:r>
         <w:t xml:space="preserve">The register is not static. New risks are identified through quarterly Audit &amp; Risk Committee review, Senate academic-affairs escalation, and Sharī’ah Advisory Board flagging, then scored on the same likelihood/impact scale and added with a mitigation owner. As the Year-11 secular expansion (28 programs, 7 new schools — Section 40) and the Nigeria/Gulf footprint mature, expected additions include:</w:t>
@@ -43087,6 +43729,12 @@
     <w:p>
       <w:pPr>
         <w:pStyle w:val="BodyText"/>
+        <w:shd w:val="clear" w:color="auto" w:fill="F7F3E8"/>
+        <w:pBdr>
+          <w:left w:val="single" w:sz="24" w:space="10" w:color="B08625"/>
+        </w:pBdr>
+        <w:ind w:left="300"/>
+        <w:spacing w:after="0"/>
       </w:pPr>
       <w:r>
         <w:rPr>
@@ -43107,6 +43755,12 @@
           <w:numId w:val="1027"/>
         </w:numPr>
         <w:pStyle w:val="Compact"/>
+        <w:shd w:val="clear" w:color="auto" w:fill="F7F3E8"/>
+        <w:pBdr>
+          <w:left w:val="single" w:sz="24" w:space="10" w:color="B08625"/>
+        </w:pBdr>
+        <w:ind w:left="300"/>
+        <w:spacing w:before="0" w:after="0"/>
       </w:pPr>
       <w:r>
         <w:t xml:space="preserve">100% of the 14 (growing to 17+) risks reviewed at least quarterly by the Audit &amp; Risk Committee.</w:t>
@@ -43119,6 +43773,12 @@
           <w:numId w:val="1027"/>
         </w:numPr>
         <w:pStyle w:val="Compact"/>
+        <w:shd w:val="clear" w:color="auto" w:fill="F7F3E8"/>
+        <w:pBdr>
+          <w:left w:val="single" w:sz="24" w:space="10" w:color="B08625"/>
+        </w:pBdr>
+        <w:ind w:left="300"/>
+        <w:spacing w:before="0" w:after="0"/>
       </w:pPr>
       <w:r>
         <w:t xml:space="preserve">Zero unremediated</w:t>
@@ -43149,6 +43809,12 @@
           <w:numId w:val="1027"/>
         </w:numPr>
         <w:pStyle w:val="Compact"/>
+        <w:shd w:val="clear" w:color="auto" w:fill="F7F3E8"/>
+        <w:pBdr>
+          <w:left w:val="single" w:sz="24" w:space="10" w:color="B08625"/>
+        </w:pBdr>
+        <w:ind w:left="300"/>
+        <w:spacing w:before="0" w:after="0"/>
       </w:pPr>
       <w:r>
         <w:t xml:space="preserve">Annual external audit completed with no material findings.</w:t>
@@ -43161,6 +43827,12 @@
           <w:numId w:val="1027"/>
         </w:numPr>
         <w:pStyle w:val="Compact"/>
+        <w:shd w:val="clear" w:color="auto" w:fill="F7F3E8"/>
+        <w:pBdr>
+          <w:left w:val="single" w:sz="24" w:space="10" w:color="B08625"/>
+        </w:pBdr>
+        <w:ind w:left="300"/>
+        <w:spacing w:before="0"/>
       </w:pPr>
       <w:r>
         <w:t xml:space="preserve">Founder/Senate compensation disclosure published annually, on schedule, every year.</w:t>
@@ -43169,6 +43841,12 @@
     <w:p>
       <w:pPr>
         <w:pStyle w:val="FirstParagraph"/>
+        <w:shd w:val="clear" w:color="auto" w:fill="F7F3E8"/>
+        <w:pBdr>
+          <w:left w:val="single" w:sz="24" w:space="10" w:color="B08625"/>
+        </w:pBdr>
+        <w:ind w:left="300"/>
+        <w:spacing w:after="0"/>
       </w:pPr>
       <w:r>
         <w:rPr>
@@ -43185,6 +43863,12 @@
     <w:p>
       <w:pPr>
         <w:pStyle w:val="BodyText"/>
+        <w:shd w:val="clear" w:color="auto" w:fill="F7F3E8"/>
+        <w:pBdr>
+          <w:left w:val="single" w:sz="24" w:space="10" w:color="B08625"/>
+        </w:pBdr>
+        <w:ind w:left="300"/>
+        <w:spacing w:before="0"/>
       </w:pPr>
       <w:r>
         <w:t xml:space="preserve">Covered exhaustively in the table above; the meta-risk is register atrophy (the register itself going stale as the institution scales) — mitigated by mandatory quarterly refresh and a standing Board agenda item.</w:t>
@@ -44390,6 +45074,12 @@
     <w:p>
       <w:pPr>
         <w:pStyle w:val="BodyText"/>
+        <w:shd w:val="clear" w:color="auto" w:fill="F7F3E8"/>
+        <w:pBdr>
+          <w:left w:val="single" w:sz="24" w:space="10" w:color="B08625"/>
+        </w:pBdr>
+        <w:ind w:left="300"/>
+        <w:spacing w:after="0"/>
       </w:pPr>
       <w:r>
         <w:rPr>
@@ -44406,6 +45096,12 @@
     <w:p>
       <w:pPr>
         <w:pStyle w:val="BodyText"/>
+        <w:shd w:val="clear" w:color="auto" w:fill="F7F3E8"/>
+        <w:pBdr>
+          <w:left w:val="single" w:sz="24" w:space="10" w:color="B08625"/>
+        </w:pBdr>
+        <w:ind w:left="300"/>
+        <w:spacing w:before="0"/>
       </w:pPr>
       <w:r>
         <w:t xml:space="preserve">100% on-time regulatory filings across all active jurisdictions; zero lapses in 501c3 or TWC Ch.132 status; ISO 21001 and CPD certifications maintained without gap from their target years onward; zero data-protection incidents involving student records.</w:t>
@@ -44414,6 +45110,12 @@
     <w:p>
       <w:pPr>
         <w:pStyle w:val="BodyText"/>
+        <w:shd w:val="clear" w:color="auto" w:fill="F7F3E8"/>
+        <w:pBdr>
+          <w:left w:val="single" w:sz="24" w:space="10" w:color="B08625"/>
+        </w:pBdr>
+        <w:ind w:left="300"/>
+        <w:spacing w:after="0"/>
       </w:pPr>
       <w:r>
         <w:rPr>
@@ -44430,6 +45132,12 @@
     <w:p>
       <w:pPr>
         <w:pStyle w:val="BodyText"/>
+        <w:shd w:val="clear" w:color="auto" w:fill="F7F3E8"/>
+        <w:pBdr>
+          <w:left w:val="single" w:sz="24" w:space="10" w:color="B08625"/>
+        </w:pBdr>
+        <w:ind w:left="300"/>
+        <w:spacing w:before="0"/>
       </w:pPr>
       <w:r>
         <w:t xml:space="preserve">Directly overlaps Risk 8 (nonprofit/for-profit commingling scrutiny — mitigated by arm’s-length shared-services pricing and independent counsel before any firewall amendment) and Risk 11 (accreditation candidacy delay — mitigated by framing candidacy as reserve-funded, not survival-dependent). Data-protection risk (unlisted in the original 14 but material given a global online student body) is managed operationally under the LMS &amp; Technology Infrastructure line (5%) rather than treated as a freestanding institutional risk, since it is a technical-control matter, not a solvency matter.</w:t>
@@ -45380,6 +46088,12 @@
     <w:p>
       <w:pPr>
         <w:pStyle w:val="BodyText"/>
+        <w:shd w:val="clear" w:color="auto" w:fill="F7F3E8"/>
+        <w:pBdr>
+          <w:left w:val="single" w:sz="24" w:space="10" w:color="B08625"/>
+        </w:pBdr>
+        <w:ind w:left="300"/>
+        <w:spacing w:after="0"/>
       </w:pPr>
       <w:r>
         <w:rPr>
@@ -45400,6 +46114,12 @@
           <w:numId w:val="1031"/>
         </w:numPr>
         <w:pStyle w:val="Compact"/>
+        <w:shd w:val="clear" w:color="auto" w:fill="F7F3E8"/>
+        <w:pBdr>
+          <w:left w:val="single" w:sz="24" w:space="10" w:color="B08625"/>
+        </w:pBdr>
+        <w:ind w:left="300"/>
+        <w:spacing w:before="0" w:after="0"/>
       </w:pPr>
       <w:r>
         <w:t xml:space="preserve">Actual annual revenue vs. the Conservative/Expected/Growth trendlines (tracked quarterly).</w:t>
@@ -45412,6 +46132,12 @@
           <w:numId w:val="1031"/>
         </w:numPr>
         <w:pStyle w:val="Compact"/>
+        <w:shd w:val="clear" w:color="auto" w:fill="F7F3E8"/>
+        <w:pBdr>
+          <w:left w:val="single" w:sz="24" w:space="10" w:color="B08625"/>
+        </w:pBdr>
+        <w:ind w:left="300"/>
+        <w:spacing w:before="0" w:after="0"/>
       </w:pPr>
       <w:r>
         <w:t xml:space="preserve">Reserve balances vs. modeled targets ($4,341,842 Liquidity / $1,240,527 Strategic Business Reserve at Yr 10).</w:t>
@@ -45424,6 +46150,12 @@
           <w:numId w:val="1031"/>
         </w:numPr>
         <w:pStyle w:val="Compact"/>
+        <w:shd w:val="clear" w:color="auto" w:fill="F7F3E8"/>
+        <w:pBdr>
+          <w:left w:val="single" w:sz="24" w:space="10" w:color="B08625"/>
+        </w:pBdr>
+        <w:ind w:left="300"/>
+        <w:spacing w:before="0" w:after="0"/>
       </w:pPr>
       <w:r>
         <w:t xml:space="preserve">Allocation-reconciliation audit: 100% of revenue accounted for to the dollar, every year, in every scenario.</w:t>
@@ -45436,6 +46168,12 @@
           <w:numId w:val="1031"/>
         </w:numPr>
         <w:pStyle w:val="Compact"/>
+        <w:shd w:val="clear" w:color="auto" w:fill="F7F3E8"/>
+        <w:pBdr>
+          <w:left w:val="single" w:sz="24" w:space="10" w:color="B08625"/>
+        </w:pBdr>
+        <w:ind w:left="300"/>
+        <w:spacing w:before="0"/>
       </w:pPr>
       <w:r>
         <w:t xml:space="preserve">Zero deficit years, cumulative, 2028–2037 and beyond.</w:t>
@@ -45508,6 +46246,12 @@
     <w:p>
       <w:pPr>
         <w:pStyle w:val="BodyText"/>
+        <w:shd w:val="clear" w:color="auto" w:fill="F7F3E8"/>
+        <w:pBdr>
+          <w:left w:val="single" w:sz="24" w:space="10" w:color="B08625"/>
+        </w:pBdr>
+        <w:ind w:left="300"/>
+        <w:spacing w:after="0"/>
       </w:pPr>
       <w:r>
         <w:rPr>
@@ -45524,6 +46268,12 @@
     <w:p>
       <w:pPr>
         <w:pStyle w:val="BodyText"/>
+        <w:shd w:val="clear" w:color="auto" w:fill="F7F3E8"/>
+        <w:pBdr>
+          <w:left w:val="single" w:sz="24" w:space="10" w:color="B08625"/>
+        </w:pBdr>
+        <w:ind w:left="300"/>
+        <w:spacing w:before="0"/>
       </w:pPr>
       <w:r>
         <w:t xml:space="preserve">Primarily Risk 6 (Nigeria delay — doesn’t affect solvency, only pace), Risk 9 (payment-gateway disruption — mitigated by redundancy), and Risk 13 (FX exposure — mitigated by rolling USD conversion). The meta-risk — model complacency — is mitigated by the annual Decade Audit checkpoint (Phase III) forcing re-validation against real results.</w:t>
@@ -46652,6 +47402,12 @@
     <w:p>
       <w:pPr>
         <w:pStyle w:val="BodyText"/>
+        <w:shd w:val="clear" w:color="auto" w:fill="F7F3E8"/>
+        <w:pBdr>
+          <w:left w:val="single" w:sz="24" w:space="10" w:color="B08625"/>
+        </w:pBdr>
+        <w:ind w:left="300"/>
+        <w:spacing w:after="0"/>
       </w:pPr>
       <w:r>
         <w:rPr>
@@ -46668,6 +47424,12 @@
     <w:p>
       <w:pPr>
         <w:pStyle w:val="BodyText"/>
+        <w:shd w:val="clear" w:color="auto" w:fill="F7F3E8"/>
+        <w:pBdr>
+          <w:left w:val="single" w:sz="24" w:space="10" w:color="B08625"/>
+        </w:pBdr>
+        <w:ind w:left="300"/>
+        <w:spacing w:before="0"/>
       </w:pPr>
       <w:r>
         <w:t xml:space="preserve">Gambia campus operational within the $50,000 ceiling and Year-2–4 window; Nigeria Reserve balance tracked against its own accrual model; zero firewall-crossing capital transactions (audited annually); any Commercial Engine co-location arrangement priced at documented fair market value.</w:t>
@@ -46676,6 +47438,12 @@
     <w:p>
       <w:pPr>
         <w:pStyle w:val="BodyText"/>
+        <w:shd w:val="clear" w:color="auto" w:fill="F7F3E8"/>
+        <w:pBdr>
+          <w:left w:val="single" w:sz="24" w:space="10" w:color="B08625"/>
+        </w:pBdr>
+        <w:ind w:left="300"/>
+        <w:spacing w:after="0"/>
       </w:pPr>
       <w:r>
         <w:rPr>
@@ -46692,6 +47460,12 @@
     <w:p>
       <w:pPr>
         <w:pStyle w:val="BodyText"/>
+        <w:shd w:val="clear" w:color="auto" w:fill="F7F3E8"/>
+        <w:pBdr>
+          <w:left w:val="single" w:sz="24" w:space="10" w:color="B08625"/>
+        </w:pBdr>
+        <w:ind w:left="300"/>
+        <w:spacing w:before="0"/>
       </w:pPr>
       <w:r>
         <w:t xml:space="preserve">Directly governed by Risk 6 (Nigeria delay/non-approval — doesn’t affect solvency), Risk 8 (commingling scrutiny — mitigated by strict source-of-funds tagging), and Risk 4 (Strategic Business Reserve deployment governance — 2/3 Senate vote + 2 independent seats above $250,000/yr, applicable if the Reserve is ever tapped for a capital co-investment).</w:t>
@@ -47950,6 +48724,12 @@
     <w:p>
       <w:pPr>
         <w:pStyle w:val="BodyText"/>
+        <w:shd w:val="clear" w:color="auto" w:fill="F7F3E8"/>
+        <w:pBdr>
+          <w:left w:val="single" w:sz="24" w:space="10" w:color="B08625"/>
+        </w:pBdr>
+        <w:ind w:left="300"/>
+        <w:spacing w:after="0"/>
       </w:pPr>
       <w:r>
         <w:rPr>
@@ -47966,6 +48746,12 @@
     <w:p>
       <w:pPr>
         <w:pStyle w:val="BodyText"/>
+        <w:shd w:val="clear" w:color="auto" w:fill="F7F3E8"/>
+        <w:pBdr>
+          <w:left w:val="single" w:sz="24" w:space="10" w:color="B08625"/>
+        </w:pBdr>
+        <w:ind w:left="300"/>
+        <w:spacing w:before="0"/>
       </w:pPr>
       <w:r>
         <w:t xml:space="preserve">Ten-year and twenty-year audited zero-deficit records achieved on schedule; all accreditation/recognition targets (CPD 2029, ISO 2030, NAQAA 2031, Nigeria charter 2037, Texas secular 2039, Gulf ministry 2040) hit within their canon target years or transparently re-forecast without altering the underlying financial model; register (Section 36) never allowed to lapse across the full horizon.</w:t>
@@ -47974,6 +48760,12 @@
     <w:p>
       <w:pPr>
         <w:pStyle w:val="BodyText"/>
+        <w:shd w:val="clear" w:color="auto" w:fill="F7F3E8"/>
+        <w:pBdr>
+          <w:left w:val="single" w:sz="24" w:space="10" w:color="B08625"/>
+        </w:pBdr>
+        <w:ind w:left="300"/>
+        <w:spacing w:after="0"/>
       </w:pPr>
       <w:r>
         <w:rPr>
@@ -47990,6 +48782,12 @@
     <w:p>
       <w:pPr>
         <w:pStyle w:val="BodyText"/>
+        <w:shd w:val="clear" w:color="auto" w:fill="F7F3E8"/>
+        <w:pBdr>
+          <w:left w:val="single" w:sz="24" w:space="10" w:color="B08625"/>
+        </w:pBdr>
+        <w:ind w:left="300"/>
+        <w:spacing w:before="0"/>
       </w:pPr>
       <w:r>
         <w:t xml:space="preserve">The roadmap’s central risk is sequencing risk — any era-II milestone arriving before its era-I precondition (e.g., secular accreditation attempted before the ten-year audited record) would violate the adopted rationale. Mitigation is structural: Year-11 secular accreditation is gated explicitly on the Year-10 audit (Section 38), not on calendar date alone.</w:t>
@@ -49577,6 +50375,12 @@
     <w:p>
       <w:pPr>
         <w:pStyle w:val="BodyText"/>
+        <w:shd w:val="clear" w:color="auto" w:fill="F7F3E8"/>
+        <w:pBdr>
+          <w:left w:val="single" w:sz="24" w:space="10" w:color="B08625"/>
+        </w:pBdr>
+        <w:ind w:left="300"/>
+        <w:spacing w:after="0"/>
       </w:pPr>
       <w:r>
         <w:rPr>
@@ -49593,6 +50397,12 @@
     <w:p>
       <w:pPr>
         <w:pStyle w:val="BodyText"/>
+        <w:shd w:val="clear" w:color="auto" w:fill="F7F3E8"/>
+        <w:pBdr>
+          <w:left w:val="single" w:sz="24" w:space="10" w:color="B08625"/>
+        </w:pBdr>
+        <w:ind w:left="300"/>
+        <w:spacing w:before="0"/>
       </w:pPr>
       <w:r>
         <w:t xml:space="preserve">Qualified Founding Registration pipeline size and geographic reach (pre-incorporation, not revenue-measured); Founding Scholarship seats funded vs. the 60–70 (Yr 1) / 125–135 (Yr 2) modeled range; conversion rate from Founding Registration to formal Year-1 application; Waqf Scholarship Block reweighting reverted to the standard 20% split on schedule from Year 3.</w:t>

</xml_diff>

<commit_message>
Switch body text to EB Garamond, unifying the typography into one family
Minion Pro, Sabon Next, and Freight Text Pro are all commercial and
can't be licensed here. Their listed #2 fallback, Adobe Garamond Pro,
has a genuine free equivalent — EB Garamond (Google Fonts, OFL), a
proper digital Garamond revival from the same lineage. Replaces
Bitstream Charter as the body face.

This is a real improvement beyond just "the closest available font":
EB Garamond body + Cormorant Garamond headings + Cinzel monumental
numerals is now a single Garamond-derived type system throughout,
rather than pairing an unrelated serif body against Garamond display
faces. Body size bumped to 11.5pt / ~15.5pt leading per spec, applied
uniformly to narrative text and table cells (kept together rather than
diverging table type from body type, since both now read as one
considered system).

Font files added to assets/fonts/, README updated accordingly.
</commit_message>
<xml_diff>
--- a/AMIU_Strategic_Blueprint_2028-2050_Publication_Edition.docx
+++ b/AMIU_Strategic_Blueprint_2028-2050_Publication_Edition.docx
@@ -487,7 +487,7 @@
         <w:t xml:space="preserve"> </w:t>
       </w:r>
       <w:r>
-        <w:t xml:space="preserve">Prepared in-house by the AMIU Office of Institutional Planning, using the AMIU institutional style system (Cinzel monumental display, Cormorant Garamond editorial headings, Bitstream Charter body serif, navy/gold institutional palette).</w:t>
+        <w:t xml:space="preserve">Prepared in-house by the AMIU Office of Institutional Planning, using the AMIU institutional style system — a single Garamond-family type system throughout (Cinzel monumental numerals, Cormorant Garamond editorial headings, EB Garamond body serif), navy/gold institutional palette.</w:t>
       </w:r>
     </w:p>
     <w:p>
@@ -2055,7 +2055,7 @@
                 <w:bCs/>
                 <w:b/>
               </w:rPr>
-              <w:t xml:space="preserve">8</w:t>
+              <w:t xml:space="preserve">9</w:t>
             </w:r>
           </w:p>
         </w:tc>
@@ -2095,8 +2095,12 @@
               <w:rPr>
                 <w:bCs/>
                 <w:b/>
+                <w:color w:val="B08625"/>
+                <w:sz w:val="20"/>
+                <w:caps/>
+                <w:spacing w:val="14"/>
               </w:rPr>
-              <w:t xml:space="preserve">9</w:t>
+              <w:t xml:space="preserve">10</w:t>
             </w:r>
           </w:p>
         </w:tc>
@@ -2141,7 +2145,7 @@
                 <w:caps/>
                 <w:spacing w:val="14"/>
               </w:rPr>
-              <w:t xml:space="preserve">10</w:t>
+              <w:t xml:space="preserve">11</w:t>
             </w:r>
           </w:p>
         </w:tc>
@@ -2186,7 +2190,7 @@
                 <w:caps/>
                 <w:spacing w:val="14"/>
               </w:rPr>
-              <w:t xml:space="preserve">11</w:t>
+              <w:t xml:space="preserve">12</w:t>
             </w:r>
           </w:p>
         </w:tc>
@@ -2231,7 +2235,7 @@
                 <w:caps/>
                 <w:spacing w:val="14"/>
               </w:rPr>
-              <w:t xml:space="preserve">13</w:t>
+              <w:t xml:space="preserve">14</w:t>
             </w:r>
           </w:p>
         </w:tc>
@@ -2276,7 +2280,7 @@
                 <w:caps/>
                 <w:spacing w:val="14"/>
               </w:rPr>
-              <w:t xml:space="preserve">19</w:t>
+              <w:t xml:space="preserve">21</w:t>
             </w:r>
           </w:p>
         </w:tc>
@@ -2321,7 +2325,7 @@
                 <w:caps/>
                 <w:spacing w:val="14"/>
               </w:rPr>
-              <w:t xml:space="preserve">19</w:t>
+              <w:t xml:space="preserve">22</w:t>
             </w:r>
           </w:p>
         </w:tc>
@@ -2366,7 +2370,7 @@
                 <w:caps/>
                 <w:spacing w:val="14"/>
               </w:rPr>
-              <w:t xml:space="preserve">20</w:t>
+              <w:t xml:space="preserve">22</w:t>
             </w:r>
           </w:p>
         </w:tc>
@@ -2411,7 +2415,7 @@
                 <w:caps/>
                 <w:spacing w:val="14"/>
               </w:rPr>
-              <w:t xml:space="preserve">20</w:t>
+              <w:t xml:space="preserve">23</w:t>
             </w:r>
           </w:p>
         </w:tc>
@@ -2456,7 +2460,7 @@
                 <w:caps/>
                 <w:spacing w:val="14"/>
               </w:rPr>
-              <w:t xml:space="preserve">21</w:t>
+              <w:t xml:space="preserve">23</w:t>
             </w:r>
           </w:p>
         </w:tc>
@@ -2501,7 +2505,7 @@
                 <w:caps/>
                 <w:spacing w:val="14"/>
               </w:rPr>
-              <w:t xml:space="preserve">24</w:t>
+              <w:t xml:space="preserve">27</w:t>
             </w:r>
           </w:p>
         </w:tc>
@@ -2546,7 +2550,7 @@
                 <w:caps/>
                 <w:spacing w:val="14"/>
               </w:rPr>
-              <w:t xml:space="preserve">27</w:t>
+              <w:t xml:space="preserve">31</w:t>
             </w:r>
           </w:p>
         </w:tc>
@@ -2591,7 +2595,7 @@
                 <w:caps/>
                 <w:spacing w:val="14"/>
               </w:rPr>
-              <w:t xml:space="preserve">32</w:t>
+              <w:t xml:space="preserve">36</w:t>
             </w:r>
           </w:p>
         </w:tc>
@@ -2620,7 +2624,7 @@
               <w:jc w:val="right"/>
             </w:pPr>
             <w:r>
-              <w:t xml:space="preserve">33</w:t>
+              <w:t xml:space="preserve">37</w:t>
             </w:r>
           </w:p>
         </w:tc>
@@ -2649,7 +2653,7 @@
               <w:jc w:val="right"/>
             </w:pPr>
             <w:r>
-              <w:t xml:space="preserve">37</w:t>
+              <w:t xml:space="preserve">41</w:t>
             </w:r>
           </w:p>
         </w:tc>
@@ -2678,7 +2682,7 @@
               <w:jc w:val="right"/>
             </w:pPr>
             <w:r>
-              <w:t xml:space="preserve">39</w:t>
+              <w:t xml:space="preserve">44</w:t>
             </w:r>
           </w:p>
         </w:tc>
@@ -2707,7 +2711,7 @@
               <w:jc w:val="right"/>
             </w:pPr>
             <w:r>
-              <w:t xml:space="preserve">42</w:t>
+              <w:t xml:space="preserve">47</w:t>
             </w:r>
           </w:p>
         </w:tc>
@@ -2736,7 +2740,7 @@
               <w:jc w:val="right"/>
             </w:pPr>
             <w:r>
-              <w:t xml:space="preserve">45</w:t>
+              <w:t xml:space="preserve">50</w:t>
             </w:r>
           </w:p>
         </w:tc>
@@ -2781,7 +2785,7 @@
                 <w:caps/>
                 <w:spacing w:val="14"/>
               </w:rPr>
-              <w:t xml:space="preserve">49</w:t>
+              <w:t xml:space="preserve">55</w:t>
             </w:r>
           </w:p>
         </w:tc>
@@ -2810,7 +2814,7 @@
               <w:jc w:val="right"/>
             </w:pPr>
             <w:r>
-              <w:t xml:space="preserve">50</w:t>
+              <w:t xml:space="preserve">56</w:t>
             </w:r>
           </w:p>
         </w:tc>
@@ -2839,7 +2843,7 @@
               <w:jc w:val="right"/>
             </w:pPr>
             <w:r>
-              <w:t xml:space="preserve">54</w:t>
+              <w:t xml:space="preserve">60</w:t>
             </w:r>
           </w:p>
         </w:tc>
@@ -2868,7 +2872,7 @@
               <w:jc w:val="right"/>
             </w:pPr>
             <w:r>
-              <w:t xml:space="preserve">57</w:t>
+              <w:t xml:space="preserve">63</w:t>
             </w:r>
           </w:p>
         </w:tc>
@@ -2897,7 +2901,7 @@
               <w:jc w:val="right"/>
             </w:pPr>
             <w:r>
-              <w:t xml:space="preserve">60</w:t>
+              <w:t xml:space="preserve">66</w:t>
             </w:r>
           </w:p>
         </w:tc>
@@ -2926,7 +2930,7 @@
               <w:jc w:val="right"/>
             </w:pPr>
             <w:r>
-              <w:t xml:space="preserve">62</w:t>
+              <w:t xml:space="preserve">69</w:t>
             </w:r>
           </w:p>
         </w:tc>
@@ -2971,7 +2975,7 @@
                 <w:caps/>
                 <w:spacing w:val="14"/>
               </w:rPr>
-              <w:t xml:space="preserve">65</w:t>
+              <w:t xml:space="preserve">73</w:t>
             </w:r>
           </w:p>
         </w:tc>
@@ -3000,7 +3004,7 @@
               <w:jc w:val="right"/>
             </w:pPr>
             <w:r>
-              <w:t xml:space="preserve">66</w:t>
+              <w:t xml:space="preserve">74</w:t>
             </w:r>
           </w:p>
         </w:tc>
@@ -3029,7 +3033,7 @@
               <w:jc w:val="right"/>
             </w:pPr>
             <w:r>
-              <w:t xml:space="preserve">68</w:t>
+              <w:t xml:space="preserve">77</w:t>
             </w:r>
           </w:p>
         </w:tc>
@@ -3058,7 +3062,7 @@
               <w:jc w:val="right"/>
             </w:pPr>
             <w:r>
-              <w:t xml:space="preserve">72</w:t>
+              <w:t xml:space="preserve">81</w:t>
             </w:r>
           </w:p>
         </w:tc>
@@ -3087,7 +3091,7 @@
               <w:jc w:val="right"/>
             </w:pPr>
             <w:r>
-              <w:t xml:space="preserve">75</w:t>
+              <w:t xml:space="preserve">85</w:t>
             </w:r>
           </w:p>
         </w:tc>
@@ -3116,7 +3120,7 @@
               <w:jc w:val="right"/>
             </w:pPr>
             <w:r>
-              <w:t xml:space="preserve">78</w:t>
+              <w:t xml:space="preserve">88</w:t>
             </w:r>
           </w:p>
         </w:tc>
@@ -3157,7 +3161,7 @@
                 <w:caps/>
                 <w:spacing w:val="14"/>
               </w:rPr>
-              <w:t xml:space="preserve">82</w:t>
+              <w:t xml:space="preserve">93</w:t>
             </w:r>
           </w:p>
         </w:tc>
@@ -3186,7 +3190,7 @@
               <w:jc w:val="right"/>
             </w:pPr>
             <w:r>
-              <w:t xml:space="preserve">83</w:t>
+              <w:t xml:space="preserve">94</w:t>
             </w:r>
           </w:p>
         </w:tc>
@@ -3215,7 +3219,7 @@
               <w:jc w:val="right"/>
             </w:pPr>
             <w:r>
-              <w:t xml:space="preserve">85</w:t>
+              <w:t xml:space="preserve">97</w:t>
             </w:r>
           </w:p>
         </w:tc>
@@ -3244,7 +3248,7 @@
               <w:jc w:val="right"/>
             </w:pPr>
             <w:r>
-              <w:t xml:space="preserve">88</w:t>
+              <w:t xml:space="preserve">100</w:t>
             </w:r>
           </w:p>
         </w:tc>
@@ -3273,7 +3277,7 @@
               <w:jc w:val="right"/>
             </w:pPr>
             <w:r>
-              <w:t xml:space="preserve">91</w:t>
+              <w:t xml:space="preserve">103</w:t>
             </w:r>
           </w:p>
         </w:tc>
@@ -3302,7 +3306,7 @@
               <w:jc w:val="right"/>
             </w:pPr>
             <w:r>
-              <w:t xml:space="preserve">93</w:t>
+              <w:t xml:space="preserve">106</w:t>
             </w:r>
           </w:p>
         </w:tc>
@@ -3347,7 +3351,7 @@
                 <w:caps/>
                 <w:spacing w:val="14"/>
               </w:rPr>
-              <w:t xml:space="preserve">98</w:t>
+              <w:t xml:space="preserve">111</w:t>
             </w:r>
           </w:p>
         </w:tc>
@@ -3376,7 +3380,7 @@
               <w:jc w:val="right"/>
             </w:pPr>
             <w:r>
-              <w:t xml:space="preserve">99</w:t>
+              <w:t xml:space="preserve">112</w:t>
             </w:r>
           </w:p>
         </w:tc>
@@ -3405,7 +3409,7 @@
               <w:jc w:val="right"/>
             </w:pPr>
             <w:r>
-              <w:t xml:space="preserve">101</w:t>
+              <w:t xml:space="preserve">115</w:t>
             </w:r>
           </w:p>
         </w:tc>
@@ -3434,7 +3438,7 @@
               <w:jc w:val="right"/>
             </w:pPr>
             <w:r>
-              <w:t xml:space="preserve">104</w:t>
+              <w:t xml:space="preserve">118</w:t>
             </w:r>
           </w:p>
         </w:tc>
@@ -3463,7 +3467,7 @@
               <w:jc w:val="right"/>
             </w:pPr>
             <w:r>
-              <w:t xml:space="preserve">106</w:t>
+              <w:t xml:space="preserve">120</w:t>
             </w:r>
           </w:p>
         </w:tc>
@@ -3492,7 +3496,7 @@
               <w:jc w:val="right"/>
             </w:pPr>
             <w:r>
-              <w:t xml:space="preserve">109</w:t>
+              <w:t xml:space="preserve">123</w:t>
             </w:r>
           </w:p>
         </w:tc>
@@ -3537,7 +3541,7 @@
                 <w:caps/>
                 <w:spacing w:val="14"/>
               </w:rPr>
-              <w:t xml:space="preserve">114</w:t>
+              <w:t xml:space="preserve">128</w:t>
             </w:r>
           </w:p>
         </w:tc>
@@ -3566,7 +3570,7 @@
               <w:jc w:val="right"/>
             </w:pPr>
             <w:r>
-              <w:t xml:space="preserve">115</w:t>
+              <w:t xml:space="preserve">129</w:t>
             </w:r>
           </w:p>
         </w:tc>
@@ -3595,7 +3599,7 @@
               <w:jc w:val="right"/>
             </w:pPr>
             <w:r>
-              <w:t xml:space="preserve">117</w:t>
+              <w:t xml:space="preserve">132</w:t>
             </w:r>
           </w:p>
         </w:tc>
@@ -3624,7 +3628,7 @@
               <w:jc w:val="right"/>
             </w:pPr>
             <w:r>
-              <w:t xml:space="preserve">119</w:t>
+              <w:t xml:space="preserve">134</w:t>
             </w:r>
           </w:p>
         </w:tc>
@@ -3653,7 +3657,7 @@
               <w:jc w:val="right"/>
             </w:pPr>
             <w:r>
-              <w:t xml:space="preserve">122</w:t>
+              <w:t xml:space="preserve">137</w:t>
             </w:r>
           </w:p>
         </w:tc>
@@ -3682,7 +3686,7 @@
               <w:jc w:val="right"/>
             </w:pPr>
             <w:r>
-              <w:t xml:space="preserve">124</w:t>
+              <w:t xml:space="preserve">140</w:t>
             </w:r>
           </w:p>
         </w:tc>
@@ -3727,7 +3731,7 @@
                 <w:caps/>
                 <w:spacing w:val="14"/>
               </w:rPr>
-              <w:t xml:space="preserve">128</w:t>
+              <w:t xml:space="preserve">144</w:t>
             </w:r>
           </w:p>
         </w:tc>
@@ -3756,7 +3760,7 @@
               <w:jc w:val="right"/>
             </w:pPr>
             <w:r>
-              <w:t xml:space="preserve">129</w:t>
+              <w:t xml:space="preserve">145</w:t>
             </w:r>
           </w:p>
         </w:tc>
@@ -3785,7 +3789,7 @@
               <w:jc w:val="right"/>
             </w:pPr>
             <w:r>
-              <w:t xml:space="preserve">131</w:t>
+              <w:t xml:space="preserve">148</w:t>
             </w:r>
           </w:p>
         </w:tc>
@@ -3814,7 +3818,7 @@
               <w:jc w:val="right"/>
             </w:pPr>
             <w:r>
-              <w:t xml:space="preserve">134</w:t>
+              <w:t xml:space="preserve">151</w:t>
             </w:r>
           </w:p>
         </w:tc>
@@ -3843,7 +3847,7 @@
               <w:jc w:val="right"/>
             </w:pPr>
             <w:r>
-              <w:t xml:space="preserve">136</w:t>
+              <w:t xml:space="preserve">154</w:t>
             </w:r>
           </w:p>
         </w:tc>
@@ -3872,7 +3876,7 @@
               <w:jc w:val="right"/>
             </w:pPr>
             <w:r>
-              <w:t xml:space="preserve">138</w:t>
+              <w:t xml:space="preserve">156</w:t>
             </w:r>
           </w:p>
         </w:tc>
@@ -3913,7 +3917,7 @@
                 <w:caps/>
                 <w:spacing w:val="14"/>
               </w:rPr>
-              <w:t xml:space="preserve">142</w:t>
+              <w:t xml:space="preserve">160</w:t>
             </w:r>
           </w:p>
         </w:tc>
@@ -3942,7 +3946,7 @@
               <w:jc w:val="right"/>
             </w:pPr>
             <w:r>
-              <w:t xml:space="preserve">143</w:t>
+              <w:t xml:space="preserve">161</w:t>
             </w:r>
           </w:p>
         </w:tc>
@@ -3971,7 +3975,7 @@
               <w:jc w:val="right"/>
             </w:pPr>
             <w:r>
-              <w:t xml:space="preserve">148</w:t>
+              <w:t xml:space="preserve">166</w:t>
             </w:r>
           </w:p>
         </w:tc>
@@ -4000,7 +4004,7 @@
               <w:jc w:val="right"/>
             </w:pPr>
             <w:r>
-              <w:t xml:space="preserve">152</w:t>
+              <w:t xml:space="preserve">172</w:t>
             </w:r>
           </w:p>
         </w:tc>
@@ -4029,7 +4033,7 @@
               <w:jc w:val="right"/>
             </w:pPr>
             <w:r>
-              <w:t xml:space="preserve">157</w:t>
+              <w:t xml:space="preserve">177</w:t>
             </w:r>
           </w:p>
         </w:tc>
@@ -4058,7 +4062,7 @@
               <w:jc w:val="right"/>
             </w:pPr>
             <w:r>
-              <w:t xml:space="preserve">162</w:t>
+              <w:t xml:space="preserve">182</w:t>
             </w:r>
           </w:p>
         </w:tc>
@@ -4087,7 +4091,7 @@
               <w:jc w:val="right"/>
             </w:pPr>
             <w:r>
-              <w:t xml:space="preserve">167</w:t>
+              <w:t xml:space="preserve">188</w:t>
             </w:r>
           </w:p>
         </w:tc>
@@ -4128,7 +4132,7 @@
                 <w:caps/>
                 <w:spacing w:val="14"/>
               </w:rPr>
-              <w:t xml:space="preserve">178</w:t>
+              <w:t xml:space="preserve">199</w:t>
             </w:r>
           </w:p>
         </w:tc>
@@ -4173,7 +4177,7 @@
                 <w:caps/>
                 <w:spacing w:val="14"/>
               </w:rPr>
-              <w:t xml:space="preserve">179</w:t>
+              <w:t xml:space="preserve">200</w:t>
             </w:r>
           </w:p>
         </w:tc>
@@ -4214,7 +4218,7 @@
                 <w:caps/>
                 <w:spacing w:val="14"/>
               </w:rPr>
-              <w:t xml:space="preserve">180</w:t>
+              <w:t xml:space="preserve">202</w:t>
             </w:r>
           </w:p>
         </w:tc>
@@ -4259,7 +4263,7 @@
                 <w:caps/>
                 <w:spacing w:val="14"/>
               </w:rPr>
-              <w:t xml:space="preserve">181</w:t>
+              <w:t xml:space="preserve">203</w:t>
             </w:r>
           </w:p>
         </w:tc>
@@ -4304,7 +4308,7 @@
                 <w:caps/>
                 <w:spacing w:val="14"/>
               </w:rPr>
-              <w:t xml:space="preserve">182</w:t>
+              <w:t xml:space="preserve">204</w:t>
             </w:r>
           </w:p>
         </w:tc>
@@ -4349,7 +4353,7 @@
                 <w:caps/>
                 <w:spacing w:val="14"/>
               </w:rPr>
-              <w:t xml:space="preserve">184</w:t>
+              <w:t xml:space="preserve">206</w:t>
             </w:r>
           </w:p>
         </w:tc>
@@ -54750,7 +54754,7 @@
     </w:r>
     <w:r>
       <w:rPr>
-        <w:rFonts w:ascii="Bitstream Charter" w:hAnsi="Bitstream Charter"/>
+        <w:rFonts w:ascii="EB Garamond" w:hAnsi="EB Garamond"/>
         <w:b w:val="0"/>
         <w:color w:val="122A4E"/>
         <w:sz w:val="20"/>
@@ -55241,16 +55245,16 @@
     <w:pPr>
       <w:keepNext w:val="0"/>
       <w:widowControl/>
-      <w:spacing w:after="160" w:before="0" w:line="283" w:lineRule="auto"/>
+      <w:spacing w:after="180" w:before="0" w:line="324" w:lineRule="auto"/>
     </w:pPr>
     <w:rPr>
-      <w:rFonts w:ascii="Bitstream Charter" w:cs="Bitstream Charter" w:eastAsia="Bitstream Charter" w:hAnsi="Bitstream Charter"/>
+      <w:rFonts w:ascii="EB Garamond" w:cs="EB Garamond" w:eastAsia="EB Garamond" w:hAnsi="EB Garamond"/>
       <w:b w:val="0"/>
       <w:i w:val="0"/>
       <w:caps w:val="0"/>
       <w:smallCaps w:val="0"/>
       <w:color w:val="1A1F2B"/>
-      <w:sz w:val="21"/>
+      <w:sz w:val="23"/>
       <w:lang w:val="en-US"/>
     </w:rPr>
   </w:style>
@@ -55261,17 +55265,17 @@
     <w:pPr>
       <w:keepNext w:val="0"/>
       <w:widowControl/>
-      <w:spacing w:after="120" w:before="0" w:line="283" w:lineRule="auto"/>
+      <w:spacing w:after="140" w:before="0" w:line="317" w:lineRule="auto"/>
     </w:pPr>
     <w:qFormat/>
     <w:rPr>
-      <w:rFonts w:ascii="Bitstream Charter" w:cs="Bitstream Charter" w:eastAsia="Bitstream Charter" w:hAnsi="Bitstream Charter"/>
+      <w:rFonts w:ascii="EB Garamond" w:cs="EB Garamond" w:eastAsia="EB Garamond" w:hAnsi="EB Garamond"/>
       <w:b w:val="0"/>
       <w:i w:val="0"/>
       <w:caps w:val="0"/>
       <w:smallCaps w:val="0"/>
       <w:color w:val="1A1F2B"/>
-      <w:sz w:val="21"/>
+      <w:sz w:val="23"/>
       <w:lang w:val="en-US"/>
     </w:rPr>
   </w:style>
@@ -55283,16 +55287,16 @@
     <w:pPr>
       <w:keepNext w:val="0"/>
       <w:widowControl/>
-      <w:spacing w:after="120" w:before="0" w:line="283" w:lineRule="auto"/>
+      <w:spacing w:after="140" w:before="0" w:line="317" w:lineRule="auto"/>
     </w:pPr>
     <w:rPr>
-      <w:rFonts w:ascii="Bitstream Charter" w:cs="Bitstream Charter" w:eastAsia="Bitstream Charter" w:hAnsi="Bitstream Charter"/>
+      <w:rFonts w:ascii="EB Garamond" w:cs="EB Garamond" w:eastAsia="EB Garamond" w:hAnsi="EB Garamond"/>
       <w:b w:val="0"/>
       <w:i w:val="0"/>
       <w:caps w:val="0"/>
       <w:smallCaps w:val="0"/>
       <w:color w:val="1A1F2B"/>
-      <w:sz w:val="21"/>
+      <w:sz w:val="23"/>
       <w:lang w:val="en-US"/>
     </w:rPr>
   </w:style>
@@ -55303,16 +55307,16 @@
     <w:pPr>
       <w:keepNext w:val="0"/>
       <w:widowControl/>
-      <w:spacing w:after="120" w:before="0" w:line="283" w:lineRule="auto"/>
+      <w:spacing w:after="140" w:before="0" w:line="317" w:lineRule="auto"/>
     </w:pPr>
     <w:rPr>
-      <w:rFonts w:ascii="Bitstream Charter" w:cs="Bitstream Charter" w:eastAsia="Bitstream Charter" w:hAnsi="Bitstream Charter"/>
+      <w:rFonts w:ascii="EB Garamond" w:cs="EB Garamond" w:eastAsia="EB Garamond" w:hAnsi="EB Garamond"/>
       <w:b w:val="0"/>
       <w:i w:val="0"/>
       <w:caps w:val="0"/>
       <w:smallCaps w:val="0"/>
       <w:color w:val="1A1F2B"/>
-      <w:sz w:val="21"/>
+      <w:sz w:val="23"/>
       <w:lang w:val="en-US"/>
     </w:rPr>
   </w:style>

</xml_diff>

<commit_message>
Balance page composition on the stat dashboard and Part dividers
Both left roughly a third to a half of the page blank below their content,
which reads as content running out rather than a deliberately composed
spread. AMIU at a Glance gets a fourth stat row (18 fixed Senate seats;
the $90-150M directional 20-year revenue target, both already-canon
figures used elsewhere) instead of stopping at three. The eight Part
divider hero-spreads get a taller panel (11100 -> 12200 twips) so the
navy panel fills more of the page instead of leaving a large gap below
it; verified this doesn't push any divider onto a second page (TOC still
resolves 68/68, page count unchanged at 217).
</commit_message>
<xml_diff>
--- a/AMIU_Strategic_Blueprint_2028-2050_Publication_Edition.docx
+++ b/AMIU_Strategic_Blueprint_2028-2050_Publication_Edition.docx
@@ -2038,6 +2038,113 @@
           </w:p>
         </w:tc>
       </w:tr>
+      <w:tr>
+        <w:trPr>
+          <w:cantSplit/>
+        </w:trPr>
+        <w:tc>
+          <w:tcPr>
+            <w:tcW w:w="4675" w:type="dxa"/>
+            <w:tcBorders>
+              <w:top w:val="single" w:sz="16" w:space="0" w:color="B08625"/>
+              <w:left w:val="single" w:sz="2" w:space="0" w:color="D8DCE5"/>
+              <w:bottom w:val="single" w:sz="2" w:space="0" w:color="D8DCE5"/>
+              <w:right w:val="single" w:sz="2" w:space="0" w:color="D8DCE5"/>
+            </w:tcBorders>
+            <w:shd w:val="clear" w:color="auto" w:fill="F6F7FA"/>
+            <w:tcMar>
+              <w:top w:w="380" w:type="dxa"/>
+              <w:left w:w="380" w:type="dxa"/>
+              <w:bottom w:w="380" w:type="dxa"/>
+              <w:right w:w="380" w:type="dxa"/>
+            </w:tcMar>
+            <w:vAlign w:val="center"/>
+          </w:tcPr>
+          <w:p>
+            <w:pPr>
+              <w:spacing w:before="0" w:after="90"/>
+              <w:suppressAutoHyphens/>
+            </w:pPr>
+            <w:r>
+              <w:rPr>
+                <w:rFonts w:ascii="Cinzel" w:hAnsi="Cinzel"/>
+                <w:b/>
+                <w:color w:val="B08625"/>
+                <w:sz w:val="22"/>
+                <w:caps/>
+                <w:spacing w:val="18"/>
+              </w:rPr>
+              <w:t>18</w:t>
+            </w:r>
+          </w:p>
+          <w:p>
+            <w:pPr>
+              <w:spacing w:before="0" w:after="0"/>
+              <w:suppressAutoHyphens/>
+            </w:pPr>
+            <w:r>
+              <w:rPr>
+                <w:rFonts w:ascii="Liberation Sans" w:hAnsi="Liberation Sans"/>
+                <w:color w:val="5B6372"/>
+                <w:sz w:val="15"/>
+                <w:spacing w:val="8"/>
+              </w:rPr>
+              <w:t>FIXED SENATE SEATS, UNALTERED SINCE INCORPORATION</w:t>
+            </w:r>
+          </w:p>
+        </w:tc>
+        <w:tc>
+          <w:tcPr>
+            <w:tcW w:w="4675" w:type="dxa"/>
+            <w:tcBorders>
+              <w:top w:val="single" w:sz="16" w:space="0" w:color="B08625"/>
+              <w:left w:val="single" w:sz="2" w:space="0" w:color="D8DCE5"/>
+              <w:bottom w:val="single" w:sz="2" w:space="0" w:color="D8DCE5"/>
+              <w:right w:val="single" w:sz="2" w:space="0" w:color="D8DCE5"/>
+            </w:tcBorders>
+            <w:shd w:val="clear" w:color="auto" w:fill="F6F7FA"/>
+            <w:tcMar>
+              <w:top w:w="380" w:type="dxa"/>
+              <w:left w:w="380" w:type="dxa"/>
+              <w:bottom w:w="380" w:type="dxa"/>
+              <w:right w:w="380" w:type="dxa"/>
+            </w:tcMar>
+            <w:vAlign w:val="center"/>
+          </w:tcPr>
+          <w:p>
+            <w:pPr>
+              <w:spacing w:before="0" w:after="90"/>
+              <w:suppressAutoHyphens/>
+            </w:pPr>
+            <w:r>
+              <w:rPr>
+                <w:rFonts w:ascii="Cinzel" w:hAnsi="Cinzel"/>
+                <w:b/>
+                <w:color w:val="B08625"/>
+                <w:sz w:val="22"/>
+                <w:caps/>
+                <w:spacing w:val="18"/>
+              </w:rPr>
+              <w:t>$90–150M</w:t>
+            </w:r>
+          </w:p>
+          <w:p>
+            <w:pPr>
+              <w:spacing w:before="0" w:after="0"/>
+              <w:suppressAutoHyphens/>
+            </w:pPr>
+            <w:r>
+              <w:rPr>
+                <w:rFonts w:ascii="Liberation Sans" w:hAnsi="Liberation Sans"/>
+                <w:color w:val="5B6372"/>
+                <w:sz w:val="15"/>
+                <w:spacing w:val="8"/>
+              </w:rPr>
+              <w:t>DIRECTIONAL TWENTY-YEAR REVENUE TARGET (2047)</w:t>
+            </w:r>
+          </w:p>
+        </w:tc>
+      </w:tr>
     </w:tbl>
     <w:p>
       <w:pPr>
@@ -10401,7 +10508,7 @@
       </w:tblGrid>
       <w:tr>
         <w:trPr>
-          <w:trHeight w:val="11100" w:hRule="atLeast"/>
+          <w:trHeight w:val="12200" w:hRule="atLeast"/>
           <w:cantSplit/>
         </w:trPr>
         <w:tc>
@@ -14290,7 +14397,7 @@
       </w:tblGrid>
       <w:tr>
         <w:trPr>
-          <w:trHeight w:val="11100" w:hRule="atLeast"/>
+          <w:trHeight w:val="12200" w:hRule="atLeast"/>
           <w:cantSplit/>
         </w:trPr>
         <w:tc>
@@ -20311,7 +20418,7 @@
       </w:tblGrid>
       <w:tr>
         <w:trPr>
-          <w:trHeight w:val="11100" w:hRule="atLeast"/>
+          <w:trHeight w:val="12200" w:hRule="atLeast"/>
           <w:cantSplit/>
         </w:trPr>
         <w:tc>
@@ -26843,7 +26950,7 @@
       </w:tblGrid>
       <w:tr>
         <w:trPr>
-          <w:trHeight w:val="11100" w:hRule="atLeast"/>
+          <w:trHeight w:val="12200" w:hRule="atLeast"/>
           <w:cantSplit/>
         </w:trPr>
         <w:tc>
@@ -31773,7 +31880,7 @@
       </w:tblGrid>
       <w:tr>
         <w:trPr>
-          <w:trHeight w:val="11100" w:hRule="atLeast"/>
+          <w:trHeight w:val="12200" w:hRule="atLeast"/>
           <w:cantSplit/>
         </w:trPr>
         <w:tc>
@@ -36485,7 +36592,7 @@
       </w:tblGrid>
       <w:tr>
         <w:trPr>
-          <w:trHeight w:val="11100" w:hRule="atLeast"/>
+          <w:trHeight w:val="12200" w:hRule="atLeast"/>
           <w:cantSplit/>
         </w:trPr>
         <w:tc>
@@ -41135,7 +41242,7 @@
       </w:tblGrid>
       <w:tr>
         <w:trPr>
-          <w:trHeight w:val="11100" w:hRule="atLeast"/>
+          <w:trHeight w:val="12200" w:hRule="atLeast"/>
           <w:cantSplit/>
         </w:trPr>
         <w:tc>
@@ -44959,7 +45066,7 @@
       </w:tblGrid>
       <w:tr>
         <w:trPr>
-          <w:trHeight w:val="11100" w:hRule="atLeast"/>
+          <w:trHeight w:val="12200" w:hRule="atLeast"/>
           <w:cantSplit/>
         </w:trPr>
         <w:tc>

</xml_diff>